<commit_message>
Update Test 03 files and reorder sections
</commit_message>
<xml_diff>
--- a/Teaching Notes/2501-Test_T.docx
+++ b/Teaching Notes/2501-Test_T.docx
@@ -3970,7 +3970,20 @@
         <w:rPr>
           <w:rFonts w:ascii="Helvetica Neue" w:hAnsi="Helvetica Neue"/>
         </w:rPr>
-        <w:t>of cutting down a great tree was negligible compared with the expense and challenge of moving wood overland from the forest where it was harvested to the shipyard or building site where it was to be used.</w:t>
+        <w:t xml:space="preserve">of cutting down a great tree was </w:t>
+      </w:r>
+      <w:r>
+        <w:rPr>
+          <w:rFonts w:ascii="Helvetica Neue" w:hAnsi="Helvetica Neue"/>
+          <w:color w:val="FF0000"/>
+        </w:rPr>
+        <w:t>negligible</w:t>
+      </w:r>
+      <w:r>
+        <w:rPr>
+          <w:rFonts w:ascii="Helvetica Neue" w:hAnsi="Helvetica Neue"/>
+        </w:rPr>
+        <w:t xml:space="preserve"> compared with the expense and challenge of moving wood overland from the forest where it was harvested to the shipyard or building site where it was to be used.</w:t>
       </w:r>
     </w:p>
     <w:p>
@@ -4048,19 +4061,17 @@
         </w:rPr>
         <w:t xml:space="preserve"> are widely </w:t>
       </w:r>
-      <w:proofErr w:type="spellStart"/>
-      <w:r>
-        <w:rPr>
-          <w:rFonts w:ascii="Helvetica Neue" w:hAnsi="Helvetica Neue"/>
-        </w:rPr>
-        <w:t>vailable</w:t>
-      </w:r>
-      <w:proofErr w:type="spellEnd"/>
-      <w:r>
-        <w:rPr>
-          <w:rFonts w:ascii="Helvetica Neue" w:hAnsi="Helvetica Neue"/>
-        </w:rPr>
-        <w:t xml:space="preserve"> is the technological limitation on harvesting forest giants. </w:t>
+      <w:r>
+        <w:rPr>
+          <w:rFonts w:ascii="Helvetica Neue" w:hAnsi="Helvetica Neue"/>
+        </w:rPr>
+        <w:t>a</w:t>
+      </w:r>
+      <w:r>
+        <w:rPr>
+          <w:rFonts w:ascii="Helvetica Neue" w:hAnsi="Helvetica Neue"/>
+        </w:rPr>
+        <w:t xml:space="preserve">vailable is the technological limitation on harvesting forest giants. </w:t>
       </w:r>
       <w:r>
         <w:rPr>
@@ -4083,15 +4094,35 @@
       <w:r>
         <w:rPr>
           <w:rFonts w:ascii="Helvetica Neue" w:hAnsi="Helvetica Neue"/>
-        </w:rPr>
-        <w:t xml:space="preserve">Big trees contain many times the potential heat energy of small trees, but harvesting them and reducing them to </w:t>
+          <w:highlight w:val="yellow"/>
+        </w:rPr>
+        <w:t>Big trees</w:t>
+      </w:r>
+      <w:r>
+        <w:rPr>
+          <w:rFonts w:ascii="Helvetica Neue" w:hAnsi="Helvetica Neue"/>
+        </w:rPr>
+        <w:t xml:space="preserve"> contain many times the potential heat energy of small trees, but harvesting them and reducing them to </w:t>
       </w:r>
       <w:r>
         <w:rPr>
           <w:rFonts w:ascii="Helvetica Neue" w:hAnsi="Helvetica Neue"/>
         </w:rPr>
         <w:lastRenderedPageBreak/>
-        <w:t xml:space="preserve">wood that is useful for burning is a formidable task as the small hand tools that most villagers possessed were hardly up to the job. </w:t>
+        <w:t xml:space="preserve">wood that is useful for burning is a </w:t>
+      </w:r>
+      <w:r>
+        <w:rPr>
+          <w:rFonts w:ascii="Helvetica Neue" w:hAnsi="Helvetica Neue"/>
+          <w:color w:val="FF0000"/>
+        </w:rPr>
+        <w:t>formidable</w:t>
+      </w:r>
+      <w:r>
+        <w:rPr>
+          <w:rFonts w:ascii="Helvetica Neue" w:hAnsi="Helvetica Neue"/>
+        </w:rPr>
+        <w:t xml:space="preserve"> task as the small hand tools that most villagers possessed were hardly up to the job. </w:t>
       </w:r>
       <w:r>
         <w:rPr>
@@ -4115,7 +4146,20 @@
         <w:rPr>
           <w:rFonts w:ascii="Helvetica Neue" w:hAnsi="Helvetica Neue"/>
         </w:rPr>
-        <w:t xml:space="preserve">A householder was better off gathering and using small pieces of wood. </w:t>
+        <w:t xml:space="preserve">A householder was better off gathering and using </w:t>
+      </w:r>
+      <w:r>
+        <w:rPr>
+          <w:rFonts w:ascii="Helvetica Neue" w:hAnsi="Helvetica Neue"/>
+          <w:highlight w:val="yellow"/>
+        </w:rPr>
+        <w:t>small pieces of wood</w:t>
+      </w:r>
+      <w:r>
+        <w:rPr>
+          <w:rFonts w:ascii="Helvetica Neue" w:hAnsi="Helvetica Neue"/>
+        </w:rPr>
+        <w:t xml:space="preserve">. </w:t>
       </w:r>
       <w:r>
         <w:rPr>
@@ -4139,7 +4183,20 @@
         <w:rPr>
           <w:rFonts w:ascii="Helvetica Neue" w:hAnsi="Helvetica Neue"/>
         </w:rPr>
-        <w:t>For fires, fallen or hanging branches that had dried out over the course of a year or so were preferable.</w:t>
+        <w:t xml:space="preserve">For fires, </w:t>
+      </w:r>
+      <w:r>
+        <w:rPr>
+          <w:rFonts w:ascii="Helvetica Neue" w:hAnsi="Helvetica Neue"/>
+          <w:highlight w:val="yellow"/>
+        </w:rPr>
+        <w:t>fallen or hanging branches</w:t>
+      </w:r>
+      <w:r>
+        <w:rPr>
+          <w:rFonts w:ascii="Helvetica Neue" w:hAnsi="Helvetica Neue"/>
+        </w:rPr>
+        <w:t xml:space="preserve"> that had dried out over the course of a year or so were preferable.</w:t>
       </w:r>
     </w:p>
     <w:p>
@@ -4152,6 +4209,48 @@
     </w:p>
     <w:p>
       <w:pPr>
+        <w:jc w:val="both"/>
+        <w:rPr>
+          <w:rFonts w:ascii="Helvetica Neue" w:hAnsi="Helvetica Neue"/>
+        </w:rPr>
+      </w:pPr>
+      <w:r>
+        <w:rPr>
+          <w:rFonts w:ascii="Helvetica Neue" w:hAnsi="Helvetica Neue" w:hint="eastAsia"/>
+        </w:rPr>
+        <w:t>对于同义词替换的不熟悉</w:t>
+      </w:r>
+    </w:p>
+    <w:p>
+      <w:pPr>
+        <w:jc w:val="both"/>
+        <w:rPr>
+          <w:rFonts w:ascii="Helvetica Neue" w:hAnsi="Helvetica Neue"/>
+        </w:rPr>
+      </w:pPr>
+      <w:r>
+        <w:rPr>
+          <w:rFonts w:ascii="Helvetica Neue" w:hAnsi="Helvetica Neue" w:hint="eastAsia"/>
+        </w:rPr>
+        <w:t>单词不认识</w:t>
+      </w:r>
+    </w:p>
+    <w:p>
+      <w:pPr>
+        <w:jc w:val="both"/>
+        <w:rPr>
+          <w:rFonts w:ascii="Helvetica Neue" w:hAnsi="Helvetica Neue" w:hint="eastAsia"/>
+        </w:rPr>
+      </w:pPr>
+      <w:r>
+        <w:rPr>
+          <w:rFonts w:ascii="Helvetica Neue" w:hAnsi="Helvetica Neue"/>
+        </w:rPr>
+        <w:t>Formidable &amp; obstacle</w:t>
+      </w:r>
+    </w:p>
+    <w:p>
+      <w:pPr>
         <w:shd w:val="clear" w:color="auto" w:fill="FFFFFF"/>
         <w:rPr>
           <w:rFonts w:ascii="Helvetica Neue" w:hAnsi="Helvetica Neue"/>
@@ -4262,14 +4361,32 @@
           <w:bCs/>
           <w:color w:val="000000"/>
         </w:rPr>
-        <w:t xml:space="preserve"> obstacle to overexploitation.</w:t>
+        <w:t xml:space="preserve"> </w:t>
+      </w:r>
+      <w:r>
+        <w:rPr>
+          <w:rFonts w:ascii="Helvetica Neue" w:hAnsi="Helvetica Neue"/>
+          <w:b/>
+          <w:bCs/>
+          <w:color w:val="FF0000"/>
+        </w:rPr>
+        <w:t>obstacle</w:t>
+      </w:r>
+      <w:r>
+        <w:rPr>
+          <w:rFonts w:ascii="Helvetica Neue" w:hAnsi="Helvetica Neue"/>
+          <w:b/>
+          <w:bCs/>
+          <w:color w:val="000000"/>
+        </w:rPr>
+        <w:t xml:space="preserve"> to overexploitation.</w:t>
       </w:r>
     </w:p>
     <w:p>
       <w:pPr>
         <w:jc w:val="both"/>
         <w:rPr>
-          <w:rFonts w:ascii="Helvetica Neue" w:hAnsi="Helvetica Neue" w:hint="eastAsia"/>
+          <w:rFonts w:ascii="Helvetica Neue" w:hAnsi="Helvetica Neue"/>
         </w:rPr>
       </w:pPr>
     </w:p>
@@ -4306,21 +4423,32 @@
         <w:rPr>
           <w:rFonts w:ascii="Helvetica Neue" w:hAnsi="Helvetica Neue"/>
         </w:rPr>
-        <w:t xml:space="preserve"> Roman writers or farming experts advocated continued to be widely used after the fall of </w:t>
-      </w:r>
-      <w:proofErr w:type="spellStart"/>
-      <w:r>
-        <w:rPr>
-          <w:rFonts w:ascii="Helvetica Neue" w:hAnsi="Helvetica Neue"/>
-        </w:rPr>
-        <w:t>Rome.They</w:t>
-      </w:r>
-      <w:proofErr w:type="spellEnd"/>
-      <w:r>
-        <w:rPr>
-          <w:rFonts w:ascii="Helvetica Neue" w:hAnsi="Helvetica Neue"/>
-        </w:rPr>
-        <w:t xml:space="preserve"> survived not because they were mandated but because they were practical methods of producing renewable supplies of the small-dimension wood that met the needs of farmers. These techniques, known as coppicing and pollarding, are occasionally still practiced today, and many Mediterranean forests still bear the marks of this kind of cultivation</w:t>
+        <w:t xml:space="preserve"> Roman writers or farming experts advocated continued to be widely used after the fall of Rome.</w:t>
+      </w:r>
+      <w:r>
+        <w:rPr>
+          <w:rFonts w:ascii="Helvetica Neue" w:hAnsi="Helvetica Neue"/>
+        </w:rPr>
+        <w:t xml:space="preserve"> </w:t>
+      </w:r>
+      <w:r>
+        <w:rPr>
+          <w:rFonts w:ascii="Helvetica Neue" w:hAnsi="Helvetica Neue"/>
+        </w:rPr>
+        <w:t xml:space="preserve">They survived not because they were mandated but because they were practical methods of producing </w:t>
+      </w:r>
+      <w:r>
+        <w:rPr>
+          <w:rFonts w:ascii="Helvetica Neue" w:hAnsi="Helvetica Neue"/>
+          <w:highlight w:val="green"/>
+        </w:rPr>
+        <w:t>renewable</w:t>
+      </w:r>
+      <w:r>
+        <w:rPr>
+          <w:rFonts w:ascii="Helvetica Neue" w:hAnsi="Helvetica Neue"/>
+        </w:rPr>
+        <w:t xml:space="preserve"> supplies of the small-dimension wood that met the needs of farmers. These techniques, known as coppicing and pollarding, are occasionally still practiced today, and many Mediterranean forests still bear the marks of this kind of cultivation</w:t>
       </w:r>
       <w:r>
         <w:rPr>
@@ -4471,14 +4599,14 @@
         <w:rPr>
           <w:rFonts w:ascii="Helvetica Neue" w:hAnsi="Helvetica Neue"/>
         </w:rPr>
-        <w:t xml:space="preserve">nor upland erosion was widespread after the fall of Rome. Upland soils were enriched rather than depleted. Those who continued to live in the area appear to have adapted well to changed conditions. They relied on the time-tested technologies of simple, minimally destructive agriculture, cultivating olives, figs, and grapes and herding sheep. Grain, the largest Roman crop, continued to be raised on small plots or on flat areas cut out of </w:t>
+        <w:t xml:space="preserve">nor upland erosion was widespread after the fall of Rome. Upland soils were enriched rather than depleted. Those who continued to live in the area appear to have adapted well to changed conditions. They relied on </w:t>
       </w:r>
       <w:r>
         <w:rPr>
           <w:rFonts w:ascii="Helvetica Neue" w:hAnsi="Helvetica Neue"/>
         </w:rPr>
         <w:lastRenderedPageBreak/>
-        <w:t>the hillside shaded by olive trees or vines. This type of farming decreases erosion and surface water runoff. The sustainable agriculture that had characterized the region before the great Roman explosion once again served the inhabitants.</w:t>
+        <w:t>the time-tested technologies of simple, minimally destructive agriculture, cultivating olives, figs, and grapes and herding sheep. Grain, the largest Roman crop, continued to be raised on small plots or on flat areas cut out of the hillside shaded by olive trees or vines. This type of farming decreases erosion and surface water runoff. The sustainable agriculture that had characterized the region before the great Roman explosion once again served the inhabitants.</w:t>
       </w:r>
     </w:p>
     <w:p/>
@@ -4786,6 +4914,7 @@
           <w:bCs/>
           <w:color w:val="000000"/>
         </w:rPr>
+        <w:lastRenderedPageBreak/>
         <w:t>According to paragraph 1, all of the following factors limited the use of big forest trees in large-structure projects EXCEPT:</w:t>
       </w:r>
     </w:p>
@@ -4803,455 +4932,455 @@
           <w:rFonts w:ascii="Helvetica Neue" w:hAnsi="Helvetica Neue"/>
           <w:color w:val="000000"/>
         </w:rPr>
+        <w:t>lack of population growth</w:t>
+      </w:r>
+    </w:p>
+    <w:p>
+      <w:pPr>
+        <w:shd w:val="clear" w:color="auto" w:fill="FFFFFF"/>
+        <w:spacing w:line="420" w:lineRule="atLeast"/>
+        <w:rPr>
+          <w:rFonts w:ascii="Helvetica Neue" w:hAnsi="Helvetica Neue"/>
+          <w:color w:val="000000"/>
+        </w:rPr>
+      </w:pPr>
+      <w:r>
+        <w:rPr>
+          <w:rFonts w:ascii="Helvetica Neue" w:hAnsi="Helvetica Neue"/>
+          <w:color w:val="000000"/>
+        </w:rPr>
+        <w:t>lack of commerce</w:t>
+      </w:r>
+    </w:p>
+    <w:p>
+      <w:pPr>
+        <w:shd w:val="clear" w:color="auto" w:fill="FFFFFF"/>
+        <w:spacing w:line="420" w:lineRule="atLeast"/>
+        <w:rPr>
+          <w:rFonts w:ascii="Helvetica Neue" w:hAnsi="Helvetica Neue"/>
+          <w:color w:val="000000"/>
+        </w:rPr>
+      </w:pPr>
+      <w:r>
+        <w:rPr>
+          <w:rFonts w:ascii="Helvetica Neue" w:hAnsi="Helvetica Neue"/>
+          <w:color w:val="000000"/>
+        </w:rPr>
+        <w:t>difficulty of finding forests from which big trees could be cut</w:t>
+      </w:r>
+    </w:p>
+    <w:p>
+      <w:pPr>
+        <w:shd w:val="clear" w:color="auto" w:fill="FFFFFF"/>
+        <w:spacing w:line="420" w:lineRule="atLeast"/>
+        <w:rPr>
+          <w:rFonts w:ascii="Helvetica Neue" w:hAnsi="Helvetica Neue"/>
+          <w:color w:val="000000"/>
+        </w:rPr>
+      </w:pPr>
+      <w:r>
+        <w:rPr>
+          <w:rFonts w:ascii="Helvetica Neue" w:hAnsi="Helvetica Neue"/>
+          <w:color w:val="000000"/>
+        </w:rPr>
+        <w:t>cost of transporting wood from the forest to the building site</w:t>
+      </w:r>
+    </w:p>
+    <w:p>
+      <w:pPr>
+        <w:shd w:val="clear" w:color="auto" w:fill="FFFFFF"/>
+        <w:spacing w:line="420" w:lineRule="atLeast"/>
+        <w:rPr>
+          <w:rFonts w:ascii="Apple Color Emoji" w:hAnsi="Apple Color Emoji" w:cs="Apple Color Emoji"/>
+          <w:color w:val="000000"/>
+        </w:rPr>
+      </w:pPr>
+    </w:p>
+    <w:p>
+      <w:pPr>
+        <w:shd w:val="clear" w:color="auto" w:fill="FFFFFF"/>
+        <w:spacing w:after="75"/>
+        <w:rPr>
+          <w:rFonts w:ascii="Helvetica Neue" w:hAnsi="Helvetica Neue"/>
+          <w:b/>
+          <w:bCs/>
+          <w:color w:val="000000"/>
+        </w:rPr>
+      </w:pPr>
+      <w:r>
+        <w:rPr>
+          <w:rFonts w:ascii="Helvetica Neue" w:hAnsi="Helvetica Neue"/>
+          <w:b/>
+          <w:bCs/>
+          <w:color w:val="000000"/>
+        </w:rPr>
+        <w:t>Which of the following can be inferred from paragraph 1 about the probable effect that the decline of the Roman Empire had on forests?</w:t>
+      </w:r>
+    </w:p>
+    <w:p>
+      <w:pPr>
+        <w:shd w:val="clear" w:color="auto" w:fill="FFFFFF"/>
+        <w:spacing w:line="420" w:lineRule="atLeast"/>
+        <w:rPr>
+          <w:rFonts w:ascii="Helvetica Neue" w:hAnsi="Helvetica Neue"/>
+          <w:color w:val="000000"/>
+        </w:rPr>
+      </w:pPr>
+      <w:r>
+        <w:rPr>
+          <w:rFonts w:ascii="Helvetica Neue" w:hAnsi="Helvetica Neue"/>
+          <w:color w:val="000000"/>
+        </w:rPr>
+        <w:t>It made forests more valuable to the landowners.</w:t>
+      </w:r>
+    </w:p>
+    <w:p>
+      <w:pPr>
+        <w:shd w:val="clear" w:color="auto" w:fill="FFFFFF"/>
+        <w:spacing w:line="420" w:lineRule="atLeast"/>
+        <w:rPr>
+          <w:rFonts w:ascii="Helvetica Neue" w:hAnsi="Helvetica Neue"/>
+          <w:color w:val="000000"/>
+        </w:rPr>
+      </w:pPr>
+      <w:r>
+        <w:rPr>
+          <w:rFonts w:ascii="Helvetica Neue" w:hAnsi="Helvetica Neue"/>
+          <w:color w:val="000000"/>
+        </w:rPr>
+        <w:t>It had little impact on the extent of tree removal</w:t>
+      </w:r>
+    </w:p>
+    <w:p>
+      <w:pPr>
+        <w:shd w:val="clear" w:color="auto" w:fill="FFFFFF"/>
+        <w:spacing w:line="420" w:lineRule="atLeast"/>
+        <w:rPr>
+          <w:rFonts w:ascii="Helvetica Neue" w:hAnsi="Helvetica Neue"/>
+          <w:color w:val="000000"/>
+        </w:rPr>
+      </w:pPr>
+      <w:r>
+        <w:rPr>
+          <w:rFonts w:ascii="Helvetica Neue" w:hAnsi="Helvetica Neue"/>
+          <w:color w:val="000000"/>
+        </w:rPr>
+        <w:t>It resulted in closer government supervision of forest clearance.</w:t>
+      </w:r>
+    </w:p>
+    <w:p>
+      <w:pPr>
+        <w:shd w:val="clear" w:color="auto" w:fill="FFFFFF"/>
+        <w:spacing w:line="420" w:lineRule="atLeast"/>
+        <w:rPr>
+          <w:rFonts w:ascii="Helvetica Neue" w:hAnsi="Helvetica Neue"/>
+          <w:color w:val="000000"/>
+        </w:rPr>
+      </w:pPr>
+      <w:r>
+        <w:rPr>
+          <w:rFonts w:ascii="Helvetica Neue" w:hAnsi="Helvetica Neue"/>
+          <w:color w:val="000000"/>
+        </w:rPr>
+        <w:t>It increased the demand for trees as building materials.</w:t>
+      </w:r>
+    </w:p>
+    <w:p>
+      <w:pPr>
+        <w:shd w:val="clear" w:color="auto" w:fill="FFFFFF"/>
+        <w:spacing w:line="420" w:lineRule="atLeast"/>
+        <w:rPr>
+          <w:rFonts w:ascii="Helvetica Neue" w:hAnsi="Helvetica Neue"/>
+          <w:color w:val="000000"/>
+        </w:rPr>
+      </w:pPr>
+    </w:p>
+    <w:p>
+      <w:pPr>
+        <w:shd w:val="clear" w:color="auto" w:fill="FFFFFF"/>
+        <w:spacing w:after="75"/>
+        <w:rPr>
+          <w:rFonts w:ascii="Helvetica Neue" w:hAnsi="Helvetica Neue"/>
+          <w:b/>
+          <w:bCs/>
+          <w:color w:val="000000"/>
+        </w:rPr>
+      </w:pPr>
+      <w:r>
+        <w:rPr>
+          <w:rFonts w:ascii="Helvetica Neue" w:hAnsi="Helvetica Neue"/>
+          <w:b/>
+          <w:bCs/>
+          <w:color w:val="000000"/>
+        </w:rPr>
+        <w:t>The word "periodically" in the passage is closest in meaning to</w:t>
+      </w:r>
+    </w:p>
+    <w:p>
+      <w:pPr>
+        <w:shd w:val="clear" w:color="auto" w:fill="FFFFFF"/>
+        <w:spacing w:line="420" w:lineRule="atLeast"/>
+        <w:rPr>
+          <w:rFonts w:ascii="Helvetica Neue" w:hAnsi="Helvetica Neue"/>
+          <w:color w:val="000000"/>
+        </w:rPr>
+      </w:pPr>
+      <w:r>
+        <w:rPr>
+          <w:rFonts w:ascii="Helvetica Neue" w:hAnsi="Helvetica Neue"/>
+          <w:color w:val="000000"/>
+        </w:rPr>
+        <w:t>at regular intervals</w:t>
+      </w:r>
+    </w:p>
+    <w:p>
+      <w:pPr>
+        <w:shd w:val="clear" w:color="auto" w:fill="FFFFFF"/>
+        <w:spacing w:line="420" w:lineRule="atLeast"/>
+        <w:rPr>
+          <w:rFonts w:ascii="Helvetica Neue" w:hAnsi="Helvetica Neue"/>
+          <w:color w:val="000000"/>
+        </w:rPr>
+      </w:pPr>
+      <w:r>
+        <w:rPr>
+          <w:rFonts w:ascii="Helvetica Neue" w:hAnsi="Helvetica Neue"/>
+          <w:color w:val="000000"/>
+        </w:rPr>
+        <w:t xml:space="preserve">many </w:t>
+      </w:r>
+      <w:proofErr w:type="gramStart"/>
+      <w:r>
+        <w:rPr>
+          <w:rFonts w:ascii="Helvetica Neue" w:hAnsi="Helvetica Neue"/>
+          <w:color w:val="000000"/>
+        </w:rPr>
+        <w:t>times</w:t>
+      </w:r>
+      <w:proofErr w:type="gramEnd"/>
+    </w:p>
+    <w:p>
+      <w:pPr>
+        <w:shd w:val="clear" w:color="auto" w:fill="FFFFFF"/>
+        <w:spacing w:line="420" w:lineRule="atLeast"/>
+        <w:rPr>
+          <w:rFonts w:ascii="Helvetica Neue" w:hAnsi="Helvetica Neue"/>
+          <w:color w:val="000000"/>
+        </w:rPr>
+      </w:pPr>
+      <w:r>
+        <w:rPr>
+          <w:rFonts w:ascii="Helvetica Neue" w:hAnsi="Helvetica Neue"/>
+          <w:color w:val="000000"/>
+        </w:rPr>
+        <w:t>profitably</w:t>
+      </w:r>
+    </w:p>
+    <w:p>
+      <w:pPr>
+        <w:shd w:val="clear" w:color="auto" w:fill="FFFFFF"/>
+        <w:spacing w:line="420" w:lineRule="atLeast"/>
+        <w:rPr>
+          <w:rFonts w:ascii="Helvetica Neue" w:hAnsi="Helvetica Neue"/>
+          <w:color w:val="000000"/>
+        </w:rPr>
+      </w:pPr>
+      <w:r>
+        <w:rPr>
+          <w:rFonts w:ascii="Helvetica Neue" w:hAnsi="Helvetica Neue"/>
+          <w:color w:val="000000"/>
+        </w:rPr>
+        <w:t>without much effort</w:t>
+      </w:r>
+    </w:p>
+    <w:p>
+      <w:pPr>
+        <w:shd w:val="clear" w:color="auto" w:fill="FFFFFF"/>
+        <w:spacing w:line="420" w:lineRule="atLeast"/>
+        <w:rPr>
+          <w:rFonts w:ascii="Helvetica Neue" w:hAnsi="Helvetica Neue"/>
+          <w:color w:val="000000"/>
+        </w:rPr>
+      </w:pPr>
+    </w:p>
+    <w:p>
+      <w:pPr>
+        <w:shd w:val="clear" w:color="auto" w:fill="FFFFFF"/>
+        <w:spacing w:after="75"/>
+        <w:rPr>
+          <w:rFonts w:ascii="Helvetica Neue" w:hAnsi="Helvetica Neue"/>
+          <w:b/>
+          <w:bCs/>
+          <w:color w:val="000000"/>
+        </w:rPr>
+      </w:pPr>
+      <w:r>
+        <w:rPr>
+          <w:rFonts w:ascii="Helvetica Neue" w:hAnsi="Helvetica Neue"/>
+          <w:b/>
+          <w:bCs/>
+          <w:color w:val="000000"/>
+        </w:rPr>
+        <w:t>According to paragraph 3, what do the coppicing and pollarding methods have in common?</w:t>
+      </w:r>
+    </w:p>
+    <w:p>
+      <w:pPr>
+        <w:shd w:val="clear" w:color="auto" w:fill="FFFFFF"/>
+        <w:spacing w:line="420" w:lineRule="atLeast"/>
+        <w:rPr>
+          <w:rFonts w:ascii="Helvetica Neue" w:hAnsi="Helvetica Neue"/>
+          <w:color w:val="000000"/>
+        </w:rPr>
+      </w:pPr>
+      <w:r>
+        <w:rPr>
+          <w:rFonts w:ascii="Helvetica Neue" w:hAnsi="Helvetica Neue"/>
+          <w:color w:val="000000"/>
+        </w:rPr>
+        <w:t>They both rely on cutting back trees to produce multiple small-diameter branches.</w:t>
+      </w:r>
+    </w:p>
+    <w:p>
+      <w:pPr>
+        <w:shd w:val="clear" w:color="auto" w:fill="FFFFFF"/>
+        <w:spacing w:line="420" w:lineRule="atLeast"/>
+        <w:rPr>
+          <w:rFonts w:ascii="Helvetica Neue" w:hAnsi="Helvetica Neue"/>
+          <w:color w:val="000000"/>
+        </w:rPr>
+      </w:pPr>
+      <w:r>
+        <w:rPr>
+          <w:rFonts w:ascii="Helvetica Neue" w:hAnsi="Helvetica Neue"/>
+          <w:color w:val="000000"/>
+        </w:rPr>
+        <w:t>They both cut back mature trees to the ground</w:t>
+      </w:r>
+    </w:p>
+    <w:p>
+      <w:pPr>
+        <w:shd w:val="clear" w:color="auto" w:fill="FFFFFF"/>
+        <w:spacing w:line="420" w:lineRule="atLeast"/>
+        <w:rPr>
+          <w:rFonts w:ascii="Helvetica Neue" w:hAnsi="Helvetica Neue"/>
+          <w:color w:val="000000"/>
+        </w:rPr>
+      </w:pPr>
+      <w:r>
+        <w:rPr>
+          <w:rFonts w:ascii="Helvetica Neue" w:hAnsi="Helvetica Neue"/>
+          <w:color w:val="000000"/>
+        </w:rPr>
+        <w:t>They both raise the productive growth above the ground to prevent its being eaten by grazing animals.</w:t>
+      </w:r>
+    </w:p>
+    <w:p>
+      <w:pPr>
+        <w:shd w:val="clear" w:color="auto" w:fill="FFFFFF"/>
+        <w:spacing w:line="420" w:lineRule="atLeast"/>
+        <w:rPr>
+          <w:rFonts w:ascii="Helvetica Neue" w:hAnsi="Helvetica Neue"/>
+          <w:color w:val="000000"/>
+        </w:rPr>
+      </w:pPr>
+      <w:r>
+        <w:rPr>
+          <w:rFonts w:ascii="Helvetica Neue" w:hAnsi="Helvetica Neue"/>
+          <w:color w:val="000000"/>
+        </w:rPr>
+        <w:t>They were both required by law after the fall of Rome.</w:t>
+      </w:r>
+    </w:p>
+    <w:p/>
+    <w:p>
+      <w:pPr>
+        <w:shd w:val="clear" w:color="auto" w:fill="FFFFFF"/>
+        <w:spacing w:after="75"/>
+        <w:rPr>
+          <w:rFonts w:ascii="Helvetica Neue" w:hAnsi="Helvetica Neue"/>
+          <w:b/>
+          <w:bCs/>
+          <w:color w:val="000000"/>
+        </w:rPr>
+      </w:pPr>
+      <w:r>
+        <w:rPr>
+          <w:rFonts w:ascii="Helvetica Neue" w:hAnsi="Helvetica Neue"/>
+          <w:b/>
+          <w:bCs/>
+          <w:color w:val="000000"/>
+        </w:rPr>
+        <w:t>According to paragraph 3, which of the following is an advantage that pollarded trees have over coppiced trees?</w:t>
+      </w:r>
+    </w:p>
+    <w:p>
+      <w:pPr>
+        <w:shd w:val="clear" w:color="auto" w:fill="FFFFFF"/>
+        <w:spacing w:line="420" w:lineRule="atLeast"/>
+        <w:rPr>
+          <w:rFonts w:ascii="Helvetica Neue" w:hAnsi="Helvetica Neue"/>
+          <w:color w:val="FF0000"/>
+        </w:rPr>
+      </w:pPr>
+      <w:r>
+        <w:rPr>
+          <w:rFonts w:ascii="Helvetica Neue" w:hAnsi="Helvetica Neue"/>
+          <w:color w:val="FF0000"/>
+        </w:rPr>
+        <w:t>They produce more branches.</w:t>
+      </w:r>
+    </w:p>
+    <w:p>
+      <w:pPr>
+        <w:shd w:val="clear" w:color="auto" w:fill="FFFFFF"/>
+        <w:spacing w:line="420" w:lineRule="atLeast"/>
+        <w:rPr>
+          <w:rFonts w:ascii="Helvetica Neue" w:hAnsi="Helvetica Neue"/>
+          <w:color w:val="000000"/>
+        </w:rPr>
+      </w:pPr>
+      <w:r>
+        <w:rPr>
+          <w:rFonts w:ascii="Helvetica Neue" w:hAnsi="Helvetica Neue"/>
+          <w:color w:val="000000"/>
+        </w:rPr>
+        <w:t>They have bigger trunks.</w:t>
+      </w:r>
+    </w:p>
+    <w:p>
+      <w:pPr>
+        <w:shd w:val="clear" w:color="auto" w:fill="FFFFFF"/>
+        <w:spacing w:line="420" w:lineRule="atLeast"/>
+        <w:rPr>
+          <w:rFonts w:ascii="Helvetica Neue" w:hAnsi="Helvetica Neue"/>
+          <w:color w:val="000000"/>
+        </w:rPr>
+      </w:pPr>
+      <w:r>
+        <w:rPr>
+          <w:rFonts w:ascii="Helvetica Neue" w:hAnsi="Helvetica Neue"/>
+          <w:color w:val="000000"/>
+        </w:rPr>
+        <w:t>They regrow more quickly.</w:t>
+      </w:r>
+    </w:p>
+    <w:p>
+      <w:pPr>
+        <w:shd w:val="clear" w:color="auto" w:fill="FFFFFF"/>
+        <w:spacing w:line="420" w:lineRule="atLeast"/>
+        <w:rPr>
+          <w:rFonts w:ascii="Helvetica Neue" w:hAnsi="Helvetica Neue"/>
+          <w:color w:val="000000"/>
+        </w:rPr>
+      </w:pPr>
+      <w:r>
+        <w:rPr>
+          <w:rFonts w:ascii="Helvetica Neue" w:hAnsi="Helvetica Neue"/>
+          <w:color w:val="000000"/>
+          <w:highlight w:val="green"/>
+        </w:rPr>
         <w:lastRenderedPageBreak/>
-        <w:t>lack of population growth</w:t>
-      </w:r>
-    </w:p>
-    <w:p>
-      <w:pPr>
-        <w:shd w:val="clear" w:color="auto" w:fill="FFFFFF"/>
-        <w:spacing w:line="420" w:lineRule="atLeast"/>
-        <w:rPr>
-          <w:rFonts w:ascii="Helvetica Neue" w:hAnsi="Helvetica Neue"/>
-          <w:color w:val="000000"/>
-        </w:rPr>
-      </w:pPr>
-      <w:r>
-        <w:rPr>
-          <w:rFonts w:ascii="Helvetica Neue" w:hAnsi="Helvetica Neue"/>
-          <w:color w:val="000000"/>
-        </w:rPr>
-        <w:t>lack of commerce</w:t>
-      </w:r>
-    </w:p>
-    <w:p>
-      <w:pPr>
-        <w:shd w:val="clear" w:color="auto" w:fill="FFFFFF"/>
-        <w:spacing w:line="420" w:lineRule="atLeast"/>
-        <w:rPr>
-          <w:rFonts w:ascii="Helvetica Neue" w:hAnsi="Helvetica Neue"/>
-          <w:color w:val="000000"/>
-        </w:rPr>
-      </w:pPr>
-      <w:r>
-        <w:rPr>
-          <w:rFonts w:ascii="Helvetica Neue" w:hAnsi="Helvetica Neue"/>
-          <w:color w:val="000000"/>
-        </w:rPr>
-        <w:t>difficulty of finding forests from which big trees could be cut</w:t>
-      </w:r>
-    </w:p>
-    <w:p>
-      <w:pPr>
-        <w:shd w:val="clear" w:color="auto" w:fill="FFFFFF"/>
-        <w:spacing w:line="420" w:lineRule="atLeast"/>
-        <w:rPr>
-          <w:rFonts w:ascii="Helvetica Neue" w:hAnsi="Helvetica Neue"/>
-          <w:color w:val="000000"/>
-        </w:rPr>
-      </w:pPr>
-      <w:r>
-        <w:rPr>
-          <w:rFonts w:ascii="Helvetica Neue" w:hAnsi="Helvetica Neue"/>
-          <w:color w:val="000000"/>
-        </w:rPr>
-        <w:t>cost of transporting wood from the forest to the building site</w:t>
-      </w:r>
-    </w:p>
-    <w:p>
-      <w:pPr>
-        <w:shd w:val="clear" w:color="auto" w:fill="FFFFFF"/>
-        <w:spacing w:line="420" w:lineRule="atLeast"/>
-        <w:rPr>
-          <w:rFonts w:ascii="Apple Color Emoji" w:hAnsi="Apple Color Emoji" w:cs="Apple Color Emoji"/>
-          <w:color w:val="000000"/>
-        </w:rPr>
-      </w:pPr>
-    </w:p>
-    <w:p>
-      <w:pPr>
-        <w:shd w:val="clear" w:color="auto" w:fill="FFFFFF"/>
-        <w:spacing w:after="75"/>
-        <w:rPr>
-          <w:rFonts w:ascii="Helvetica Neue" w:hAnsi="Helvetica Neue"/>
-          <w:b/>
-          <w:bCs/>
-          <w:color w:val="000000"/>
-        </w:rPr>
-      </w:pPr>
-      <w:r>
-        <w:rPr>
-          <w:rFonts w:ascii="Helvetica Neue" w:hAnsi="Helvetica Neue"/>
-          <w:b/>
-          <w:bCs/>
-          <w:color w:val="000000"/>
-        </w:rPr>
-        <w:t>Which of the following can be inferred from paragraph 1 about the probable effect that the decline of the Roman Empire had on forests?</w:t>
-      </w:r>
-    </w:p>
-    <w:p>
-      <w:pPr>
-        <w:shd w:val="clear" w:color="auto" w:fill="FFFFFF"/>
-        <w:spacing w:line="420" w:lineRule="atLeast"/>
-        <w:rPr>
-          <w:rFonts w:ascii="Helvetica Neue" w:hAnsi="Helvetica Neue"/>
-          <w:color w:val="000000"/>
-        </w:rPr>
-      </w:pPr>
-      <w:r>
-        <w:rPr>
-          <w:rFonts w:ascii="Helvetica Neue" w:hAnsi="Helvetica Neue"/>
-          <w:color w:val="000000"/>
-        </w:rPr>
-        <w:t>It made forests more valuable to the landowners.</w:t>
-      </w:r>
-    </w:p>
-    <w:p>
-      <w:pPr>
-        <w:shd w:val="clear" w:color="auto" w:fill="FFFFFF"/>
-        <w:spacing w:line="420" w:lineRule="atLeast"/>
-        <w:rPr>
-          <w:rFonts w:ascii="Helvetica Neue" w:hAnsi="Helvetica Neue"/>
-          <w:color w:val="000000"/>
-        </w:rPr>
-      </w:pPr>
-      <w:r>
-        <w:rPr>
-          <w:rFonts w:ascii="Helvetica Neue" w:hAnsi="Helvetica Neue"/>
-          <w:color w:val="000000"/>
-        </w:rPr>
-        <w:t>It had little impact on the extent of tree removal</w:t>
-      </w:r>
-    </w:p>
-    <w:p>
-      <w:pPr>
-        <w:shd w:val="clear" w:color="auto" w:fill="FFFFFF"/>
-        <w:spacing w:line="420" w:lineRule="atLeast"/>
-        <w:rPr>
-          <w:rFonts w:ascii="Helvetica Neue" w:hAnsi="Helvetica Neue"/>
-          <w:color w:val="000000"/>
-        </w:rPr>
-      </w:pPr>
-      <w:r>
-        <w:rPr>
-          <w:rFonts w:ascii="Helvetica Neue" w:hAnsi="Helvetica Neue"/>
-          <w:color w:val="000000"/>
-        </w:rPr>
-        <w:t>It resulted in closer government supervision of forest clearance.</w:t>
-      </w:r>
-    </w:p>
-    <w:p>
-      <w:pPr>
-        <w:shd w:val="clear" w:color="auto" w:fill="FFFFFF"/>
-        <w:spacing w:line="420" w:lineRule="atLeast"/>
-        <w:rPr>
-          <w:rFonts w:ascii="Helvetica Neue" w:hAnsi="Helvetica Neue"/>
-          <w:color w:val="000000"/>
-        </w:rPr>
-      </w:pPr>
-      <w:r>
-        <w:rPr>
-          <w:rFonts w:ascii="Helvetica Neue" w:hAnsi="Helvetica Neue"/>
-          <w:color w:val="000000"/>
-        </w:rPr>
-        <w:t>It increased the demand for trees as building materials.</w:t>
-      </w:r>
-    </w:p>
-    <w:p>
-      <w:pPr>
-        <w:shd w:val="clear" w:color="auto" w:fill="FFFFFF"/>
-        <w:spacing w:line="420" w:lineRule="atLeast"/>
-        <w:rPr>
-          <w:rFonts w:ascii="Helvetica Neue" w:hAnsi="Helvetica Neue"/>
-          <w:color w:val="000000"/>
-        </w:rPr>
-      </w:pPr>
-    </w:p>
-    <w:p>
-      <w:pPr>
-        <w:shd w:val="clear" w:color="auto" w:fill="FFFFFF"/>
-        <w:spacing w:after="75"/>
-        <w:rPr>
-          <w:rFonts w:ascii="Helvetica Neue" w:hAnsi="Helvetica Neue"/>
-          <w:b/>
-          <w:bCs/>
-          <w:color w:val="000000"/>
-        </w:rPr>
-      </w:pPr>
-      <w:r>
-        <w:rPr>
-          <w:rFonts w:ascii="Helvetica Neue" w:hAnsi="Helvetica Neue"/>
-          <w:b/>
-          <w:bCs/>
-          <w:color w:val="000000"/>
-        </w:rPr>
-        <w:t>The word "periodically" in the passage is closest in meaning to</w:t>
-      </w:r>
-    </w:p>
-    <w:p>
-      <w:pPr>
-        <w:shd w:val="clear" w:color="auto" w:fill="FFFFFF"/>
-        <w:spacing w:line="420" w:lineRule="atLeast"/>
-        <w:rPr>
-          <w:rFonts w:ascii="Helvetica Neue" w:hAnsi="Helvetica Neue"/>
-          <w:color w:val="000000"/>
-        </w:rPr>
-      </w:pPr>
-      <w:r>
-        <w:rPr>
-          <w:rFonts w:ascii="Helvetica Neue" w:hAnsi="Helvetica Neue"/>
-          <w:color w:val="000000"/>
-        </w:rPr>
-        <w:t>at regular intervals</w:t>
-      </w:r>
-    </w:p>
-    <w:p>
-      <w:pPr>
-        <w:shd w:val="clear" w:color="auto" w:fill="FFFFFF"/>
-        <w:spacing w:line="420" w:lineRule="atLeast"/>
-        <w:rPr>
-          <w:rFonts w:ascii="Helvetica Neue" w:hAnsi="Helvetica Neue"/>
-          <w:color w:val="000000"/>
-        </w:rPr>
-      </w:pPr>
-      <w:r>
-        <w:rPr>
-          <w:rFonts w:ascii="Helvetica Neue" w:hAnsi="Helvetica Neue"/>
-          <w:color w:val="000000"/>
-        </w:rPr>
-        <w:t xml:space="preserve">many </w:t>
-      </w:r>
-      <w:proofErr w:type="gramStart"/>
-      <w:r>
-        <w:rPr>
-          <w:rFonts w:ascii="Helvetica Neue" w:hAnsi="Helvetica Neue"/>
-          <w:color w:val="000000"/>
-        </w:rPr>
-        <w:t>times</w:t>
-      </w:r>
-      <w:proofErr w:type="gramEnd"/>
-    </w:p>
-    <w:p>
-      <w:pPr>
-        <w:shd w:val="clear" w:color="auto" w:fill="FFFFFF"/>
-        <w:spacing w:line="420" w:lineRule="atLeast"/>
-        <w:rPr>
-          <w:rFonts w:ascii="Helvetica Neue" w:hAnsi="Helvetica Neue"/>
-          <w:color w:val="000000"/>
-        </w:rPr>
-      </w:pPr>
-      <w:r>
-        <w:rPr>
-          <w:rFonts w:ascii="Helvetica Neue" w:hAnsi="Helvetica Neue"/>
-          <w:color w:val="000000"/>
-        </w:rPr>
-        <w:t>profitably</w:t>
-      </w:r>
-    </w:p>
-    <w:p>
-      <w:pPr>
-        <w:shd w:val="clear" w:color="auto" w:fill="FFFFFF"/>
-        <w:spacing w:line="420" w:lineRule="atLeast"/>
-        <w:rPr>
-          <w:rFonts w:ascii="Helvetica Neue" w:hAnsi="Helvetica Neue"/>
-          <w:color w:val="000000"/>
-        </w:rPr>
-      </w:pPr>
-      <w:r>
-        <w:rPr>
-          <w:rFonts w:ascii="Helvetica Neue" w:hAnsi="Helvetica Neue"/>
-          <w:color w:val="000000"/>
-        </w:rPr>
-        <w:t>without much effort</w:t>
-      </w:r>
-    </w:p>
-    <w:p>
-      <w:pPr>
-        <w:shd w:val="clear" w:color="auto" w:fill="FFFFFF"/>
-        <w:spacing w:line="420" w:lineRule="atLeast"/>
-        <w:rPr>
-          <w:rFonts w:ascii="Helvetica Neue" w:hAnsi="Helvetica Neue"/>
-          <w:color w:val="000000"/>
-        </w:rPr>
-      </w:pPr>
-    </w:p>
-    <w:p>
-      <w:pPr>
-        <w:shd w:val="clear" w:color="auto" w:fill="FFFFFF"/>
-        <w:spacing w:after="75"/>
-        <w:rPr>
-          <w:rFonts w:ascii="Helvetica Neue" w:hAnsi="Helvetica Neue"/>
-          <w:b/>
-          <w:bCs/>
-          <w:color w:val="000000"/>
-        </w:rPr>
-      </w:pPr>
-      <w:r>
-        <w:rPr>
-          <w:rFonts w:ascii="Helvetica Neue" w:hAnsi="Helvetica Neue"/>
-          <w:b/>
-          <w:bCs/>
-          <w:color w:val="000000"/>
-        </w:rPr>
-        <w:t>According to paragraph 3, what do the coppicing and pollarding methods have in common?</w:t>
-      </w:r>
-    </w:p>
-    <w:p>
-      <w:pPr>
-        <w:shd w:val="clear" w:color="auto" w:fill="FFFFFF"/>
-        <w:spacing w:line="420" w:lineRule="atLeast"/>
-        <w:rPr>
-          <w:rFonts w:ascii="Helvetica Neue" w:hAnsi="Helvetica Neue"/>
-          <w:color w:val="000000"/>
-        </w:rPr>
-      </w:pPr>
-      <w:r>
-        <w:rPr>
-          <w:rFonts w:ascii="Helvetica Neue" w:hAnsi="Helvetica Neue"/>
-          <w:color w:val="000000"/>
-        </w:rPr>
-        <w:t>They both rely on cutting back trees to produce multiple small-diameter branches.</w:t>
-      </w:r>
-    </w:p>
-    <w:p>
-      <w:pPr>
-        <w:shd w:val="clear" w:color="auto" w:fill="FFFFFF"/>
-        <w:spacing w:line="420" w:lineRule="atLeast"/>
-        <w:rPr>
-          <w:rFonts w:ascii="Helvetica Neue" w:hAnsi="Helvetica Neue"/>
-          <w:color w:val="000000"/>
-        </w:rPr>
-      </w:pPr>
-      <w:r>
-        <w:rPr>
-          <w:rFonts w:ascii="Helvetica Neue" w:hAnsi="Helvetica Neue"/>
-          <w:color w:val="000000"/>
-        </w:rPr>
-        <w:t>They both cut back mature trees to the ground</w:t>
-      </w:r>
-    </w:p>
-    <w:p>
-      <w:pPr>
-        <w:shd w:val="clear" w:color="auto" w:fill="FFFFFF"/>
-        <w:spacing w:line="420" w:lineRule="atLeast"/>
-        <w:rPr>
-          <w:rFonts w:ascii="Helvetica Neue" w:hAnsi="Helvetica Neue"/>
-          <w:color w:val="000000"/>
-        </w:rPr>
-      </w:pPr>
-      <w:r>
-        <w:rPr>
-          <w:rFonts w:ascii="Helvetica Neue" w:hAnsi="Helvetica Neue"/>
-          <w:color w:val="000000"/>
-        </w:rPr>
-        <w:t>They both raise the productive growth above the ground to prevent its being eaten by grazing animals.</w:t>
-      </w:r>
-    </w:p>
-    <w:p>
-      <w:pPr>
-        <w:shd w:val="clear" w:color="auto" w:fill="FFFFFF"/>
-        <w:spacing w:line="420" w:lineRule="atLeast"/>
-        <w:rPr>
-          <w:rFonts w:ascii="Helvetica Neue" w:hAnsi="Helvetica Neue"/>
-          <w:color w:val="000000"/>
-        </w:rPr>
-      </w:pPr>
-      <w:r>
-        <w:rPr>
-          <w:rFonts w:ascii="Helvetica Neue" w:hAnsi="Helvetica Neue"/>
-          <w:color w:val="000000"/>
-        </w:rPr>
-        <w:t>They were both required by law after the fall of Rome.</w:t>
-      </w:r>
-    </w:p>
-    <w:p/>
-    <w:p>
-      <w:pPr>
-        <w:shd w:val="clear" w:color="auto" w:fill="FFFFFF"/>
-        <w:spacing w:after="75"/>
-        <w:rPr>
-          <w:rFonts w:ascii="Helvetica Neue" w:hAnsi="Helvetica Neue"/>
-          <w:b/>
-          <w:bCs/>
-          <w:color w:val="000000"/>
-        </w:rPr>
-      </w:pPr>
-      <w:r>
-        <w:rPr>
-          <w:rFonts w:ascii="Helvetica Neue" w:hAnsi="Helvetica Neue"/>
-          <w:b/>
-          <w:bCs/>
-          <w:color w:val="000000"/>
-        </w:rPr>
-        <w:t>According to paragraph 3, which of the following is an advantage that pollarded trees have over coppiced trees?</w:t>
-      </w:r>
-    </w:p>
-    <w:p>
-      <w:pPr>
-        <w:shd w:val="clear" w:color="auto" w:fill="FFFFFF"/>
-        <w:spacing w:line="420" w:lineRule="atLeast"/>
-        <w:rPr>
-          <w:rFonts w:ascii="Helvetica Neue" w:hAnsi="Helvetica Neue"/>
-          <w:color w:val="FF0000"/>
-        </w:rPr>
-      </w:pPr>
-      <w:r>
-        <w:rPr>
-          <w:rFonts w:ascii="Helvetica Neue" w:hAnsi="Helvetica Neue"/>
-          <w:color w:val="FF0000"/>
-        </w:rPr>
-        <w:t>They produce more branches.</w:t>
-      </w:r>
-    </w:p>
-    <w:p>
-      <w:pPr>
-        <w:shd w:val="clear" w:color="auto" w:fill="FFFFFF"/>
-        <w:spacing w:line="420" w:lineRule="atLeast"/>
-        <w:rPr>
-          <w:rFonts w:ascii="Helvetica Neue" w:hAnsi="Helvetica Neue"/>
-          <w:color w:val="000000"/>
-        </w:rPr>
-      </w:pPr>
-      <w:r>
-        <w:rPr>
-          <w:rFonts w:ascii="Helvetica Neue" w:hAnsi="Helvetica Neue"/>
-          <w:color w:val="000000"/>
-        </w:rPr>
-        <w:t>They have bigger trunks.</w:t>
-      </w:r>
-    </w:p>
-    <w:p>
-      <w:pPr>
-        <w:shd w:val="clear" w:color="auto" w:fill="FFFFFF"/>
-        <w:spacing w:line="420" w:lineRule="atLeast"/>
-        <w:rPr>
-          <w:rFonts w:ascii="Helvetica Neue" w:hAnsi="Helvetica Neue"/>
-          <w:color w:val="000000"/>
-        </w:rPr>
-      </w:pPr>
-      <w:r>
-        <w:rPr>
-          <w:rFonts w:ascii="Helvetica Neue" w:hAnsi="Helvetica Neue"/>
-          <w:color w:val="000000"/>
-        </w:rPr>
-        <w:t>They regrow more quickly.</w:t>
-      </w:r>
-    </w:p>
-    <w:p>
-      <w:pPr>
-        <w:shd w:val="clear" w:color="auto" w:fill="FFFFFF"/>
-        <w:spacing w:line="420" w:lineRule="atLeast"/>
-        <w:rPr>
-          <w:rFonts w:ascii="Helvetica Neue" w:hAnsi="Helvetica Neue"/>
-          <w:color w:val="000000"/>
-        </w:rPr>
-      </w:pPr>
-      <w:r>
-        <w:rPr>
-          <w:rFonts w:ascii="Helvetica Neue" w:hAnsi="Helvetica Neue"/>
-          <w:color w:val="000000"/>
-          <w:highlight w:val="green"/>
-        </w:rPr>
         <w:t>They are not damaged</w:t>
       </w:r>
       <w:r>
@@ -5267,7 +5396,7 @@
         <w:shd w:val="clear" w:color="auto" w:fill="FFFFFF"/>
         <w:spacing w:line="420" w:lineRule="atLeast"/>
         <w:rPr>
-          <w:rFonts w:ascii="Helvetica Neue" w:hAnsi="Helvetica Neue" w:hint="eastAsia"/>
+          <w:rFonts w:ascii="Helvetica Neue" w:hAnsi="Helvetica Neue"/>
           <w:color w:val="000000"/>
         </w:rPr>
       </w:pPr>
@@ -5445,30 +5574,140 @@
         <w:shd w:val="clear" w:color="auto" w:fill="FFFFFF"/>
         <w:spacing w:line="270" w:lineRule="atLeast"/>
         <w:rPr>
+          <w:rFonts w:ascii="Helvetica Neue" w:hAnsi="Helvetica Neue"/>
+          <w:color w:val="333333"/>
+        </w:rPr>
+      </w:pPr>
+      <w:r>
+        <w:rPr>
+          <w:rFonts w:ascii="Helvetica Neue" w:hAnsi="Helvetica Neue"/>
+          <w:color w:val="333333"/>
+        </w:rPr>
+        <w:t xml:space="preserve">A. The protection and supervision of upland forests and woodlands that </w:t>
+      </w:r>
+      <w:r>
+        <w:rPr>
+          <w:rFonts w:ascii="Helvetica Neue" w:hAnsi="Helvetica Neue"/>
+          <w:color w:val="FF0000"/>
+        </w:rPr>
+        <w:t xml:space="preserve">existed under the Romans </w:t>
+      </w:r>
+      <w:r>
+        <w:rPr>
+          <w:rFonts w:ascii="Helvetica Neue" w:hAnsi="Helvetica Neue"/>
+          <w:color w:val="333333"/>
+        </w:rPr>
+        <w:t>continued uninterrupted by those who continued to live in the area.</w:t>
+      </w:r>
+      <w:r>
+        <w:rPr>
           <w:rFonts w:ascii="Helvetica Neue" w:hAnsi="Helvetica Neue" w:hint="eastAsia"/>
           <w:color w:val="333333"/>
         </w:rPr>
-      </w:pPr>
-      <w:r>
-        <w:rPr>
-          <w:rFonts w:ascii="Helvetica Neue" w:hAnsi="Helvetica Neue"/>
-          <w:color w:val="333333"/>
-        </w:rPr>
-        <w:t xml:space="preserve">A. The protection and supervision of upland forests and woodlands that </w:t>
+        <w:t xml:space="preserve"> </w:t>
+      </w:r>
+      <w:r>
+        <w:rPr>
+          <w:rFonts w:ascii="Helvetica Neue" w:hAnsi="Helvetica Neue" w:hint="eastAsia"/>
+          <w:color w:val="333333"/>
+          <w:highlight w:val="yellow"/>
+        </w:rPr>
+        <w:t>说政府控制还继续存在</w:t>
+      </w:r>
+      <w:r>
+        <w:rPr>
+          <w:rFonts w:ascii="Helvetica Neue" w:hAnsi="Helvetica Neue" w:hint="eastAsia"/>
+          <w:color w:val="333333"/>
+          <w:highlight w:val="yellow"/>
+        </w:rPr>
+        <w:t xml:space="preserve"> </w:t>
+      </w:r>
+      <w:r>
+        <w:rPr>
+          <w:rFonts w:ascii="Helvetica Neue" w:hAnsi="Helvetica Neue" w:hint="eastAsia"/>
+          <w:color w:val="333333"/>
+          <w:highlight w:val="yellow"/>
+        </w:rPr>
+        <w:t>与</w:t>
+      </w:r>
+      <w:r>
+        <w:rPr>
+          <w:rFonts w:ascii="Helvetica Neue" w:hAnsi="Helvetica Neue" w:hint="eastAsia"/>
+          <w:color w:val="333333"/>
+          <w:highlight w:val="yellow"/>
+        </w:rPr>
+        <w:t>P1</w:t>
+      </w:r>
+      <w:r>
+        <w:rPr>
+          <w:rFonts w:ascii="Helvetica Neue" w:hAnsi="Helvetica Neue" w:hint="eastAsia"/>
+          <w:color w:val="333333"/>
+          <w:highlight w:val="yellow"/>
+        </w:rPr>
+        <w:t>相反</w:t>
+      </w:r>
+      <w:r>
+        <w:rPr>
+          <w:rFonts w:ascii="Helvetica Neue" w:hAnsi="Helvetica Neue" w:hint="eastAsia"/>
+          <w:color w:val="333333"/>
+          <w:highlight w:val="yellow"/>
+        </w:rPr>
+        <w:t xml:space="preserve"> </w:t>
+      </w:r>
+      <w:r>
+        <w:rPr>
+          <w:rFonts w:ascii="Helvetica Neue" w:hAnsi="Helvetica Neue" w:hint="eastAsia"/>
+          <w:color w:val="333333"/>
+          <w:highlight w:val="yellow"/>
+        </w:rPr>
+        <w:t>错误</w:t>
+      </w:r>
+      <w:r>
+        <w:rPr>
+          <w:rFonts w:ascii="Helvetica Neue" w:hAnsi="Helvetica Neue" w:hint="eastAsia"/>
+          <w:color w:val="333333"/>
+          <w:highlight w:val="yellow"/>
+        </w:rPr>
+        <w:t xml:space="preserve"> </w:t>
+      </w:r>
+      <w:r>
+        <w:rPr>
+          <w:rFonts w:ascii="Helvetica Neue" w:hAnsi="Helvetica Neue" w:hint="eastAsia"/>
+          <w:color w:val="333333"/>
+          <w:highlight w:val="yellow"/>
+        </w:rPr>
+        <w:t>且非主要观点</w:t>
+      </w:r>
+    </w:p>
+    <w:p>
+      <w:pPr>
+        <w:shd w:val="clear" w:color="auto" w:fill="FFFFFF"/>
+        <w:spacing w:line="270" w:lineRule="atLeast"/>
+        <w:rPr>
+          <w:rFonts w:ascii="Helvetica Neue" w:hAnsi="Helvetica Neue"/>
+          <w:color w:val="333333"/>
+        </w:rPr>
+      </w:pPr>
+      <w:r>
+        <w:rPr>
+          <w:rFonts w:ascii="Helvetica Neue" w:hAnsi="Helvetica Neue"/>
+          <w:color w:val="333333"/>
+        </w:rPr>
+        <w:t xml:space="preserve">B. </w:t>
       </w:r>
       <w:r>
         <w:rPr>
           <w:rFonts w:ascii="Helvetica Neue" w:hAnsi="Helvetica Neue"/>
           <w:color w:val="FF0000"/>
         </w:rPr>
-        <w:t xml:space="preserve">existed under the Romans </w:t>
-      </w:r>
-      <w:r>
-        <w:rPr>
-          <w:rFonts w:ascii="Helvetica Neue" w:hAnsi="Helvetica Neue"/>
-          <w:color w:val="333333"/>
-        </w:rPr>
-        <w:t>continued uninterrupted by those who continued to live in the area.</w:t>
+        <w:t>Exploitation of lowland fields was taken over</w:t>
+      </w:r>
+      <w:r>
+        <w:rPr>
+          <w:rFonts w:ascii="Helvetica Neue" w:hAnsi="Helvetica Neue"/>
+          <w:color w:val="333333"/>
+        </w:rPr>
+        <w:t xml:space="preserve"> by villagers and householders after the fields were abandoned by the Romans.</w:t>
       </w:r>
       <w:r>
         <w:rPr>
@@ -5481,9 +5720,48 @@
         <w:rPr>
           <w:rFonts w:ascii="Helvetica Neue" w:hAnsi="Helvetica Neue" w:hint="eastAsia"/>
           <w:color w:val="333333"/>
+        </w:rPr>
+        <w:t>低地被放弃，但没有强调接管</w:t>
+      </w:r>
+    </w:p>
+    <w:p>
+      <w:pPr>
+        <w:shd w:val="clear" w:color="auto" w:fill="FFFFFF"/>
+        <w:spacing w:line="270" w:lineRule="atLeast"/>
+        <w:rPr>
+          <w:rFonts w:ascii="Helvetica Neue" w:hAnsi="Helvetica Neue"/>
+          <w:color w:val="333333"/>
+        </w:rPr>
+      </w:pPr>
+      <w:r>
+        <w:rPr>
+          <w:rFonts w:ascii="Helvetica Neue" w:hAnsi="Helvetica Neue"/>
+          <w:color w:val="333333"/>
+          <w:highlight w:val="green"/>
+        </w:rPr>
+        <w:t>C. Harvesting</w:t>
+      </w:r>
+      <w:r>
+        <w:rPr>
+          <w:rFonts w:ascii="Helvetica Neue" w:hAnsi="Helvetica Neue"/>
+          <w:color w:val="333333"/>
+        </w:rPr>
+        <w:t xml:space="preserve"> large trees and preparing their wood for use was difficult with the limited tools available at the time.</w:t>
+      </w:r>
+      <w:r>
+        <w:rPr>
+          <w:rFonts w:ascii="Helvetica Neue" w:hAnsi="Helvetica Neue" w:hint="eastAsia"/>
+          <w:color w:val="333333"/>
+        </w:rPr>
+        <w:t xml:space="preserve"> </w:t>
+      </w:r>
+      <w:r>
+        <w:rPr>
+          <w:rFonts w:ascii="Helvetica Neue" w:hAnsi="Helvetica Neue" w:hint="eastAsia"/>
+          <w:color w:val="333333"/>
           <w:highlight w:val="yellow"/>
         </w:rPr>
-        <w:t>说政府控制还继续存在</w:t>
+        <w:t>工具使得伐木困难</w:t>
       </w:r>
       <w:r>
         <w:rPr>
@@ -5491,63 +5769,15 @@
           <w:color w:val="333333"/>
           <w:highlight w:val="yellow"/>
         </w:rPr>
-        <w:t xml:space="preserve"> </w:t>
-      </w:r>
-      <w:r>
-        <w:rPr>
-          <w:rFonts w:ascii="Helvetica Neue" w:hAnsi="Helvetica Neue" w:hint="eastAsia"/>
+        <w:t xml:space="preserve"> P</w:t>
+      </w:r>
+      <w:r>
+        <w:rPr>
+          <w:rFonts w:ascii="Helvetica Neue" w:hAnsi="Helvetica Neue"/>
           <w:color w:val="333333"/>
           <w:highlight w:val="yellow"/>
         </w:rPr>
-        <w:t>与</w:t>
-      </w:r>
-      <w:r>
-        <w:rPr>
-          <w:rFonts w:ascii="Helvetica Neue" w:hAnsi="Helvetica Neue" w:hint="eastAsia"/>
-          <w:color w:val="333333"/>
-          <w:highlight w:val="yellow"/>
-        </w:rPr>
-        <w:t>P1</w:t>
-      </w:r>
-      <w:r>
-        <w:rPr>
-          <w:rFonts w:ascii="Helvetica Neue" w:hAnsi="Helvetica Neue" w:hint="eastAsia"/>
-          <w:color w:val="333333"/>
-          <w:highlight w:val="yellow"/>
-        </w:rPr>
-        <w:t>相反</w:t>
-      </w:r>
-      <w:r>
-        <w:rPr>
-          <w:rFonts w:ascii="Helvetica Neue" w:hAnsi="Helvetica Neue" w:hint="eastAsia"/>
-          <w:color w:val="333333"/>
-          <w:highlight w:val="yellow"/>
-        </w:rPr>
-        <w:t xml:space="preserve"> </w:t>
-      </w:r>
-      <w:r>
-        <w:rPr>
-          <w:rFonts w:ascii="Helvetica Neue" w:hAnsi="Helvetica Neue" w:hint="eastAsia"/>
-          <w:color w:val="333333"/>
-          <w:highlight w:val="yellow"/>
-        </w:rPr>
-        <w:t>错误</w:t>
-      </w:r>
-      <w:r>
-        <w:rPr>
-          <w:rFonts w:ascii="Helvetica Neue" w:hAnsi="Helvetica Neue" w:hint="eastAsia"/>
-          <w:color w:val="333333"/>
-          <w:highlight w:val="yellow"/>
-        </w:rPr>
-        <w:t xml:space="preserve"> </w:t>
-      </w:r>
-      <w:r>
-        <w:rPr>
-          <w:rFonts w:ascii="Helvetica Neue" w:hAnsi="Helvetica Neue" w:hint="eastAsia"/>
-          <w:color w:val="333333"/>
-          <w:highlight w:val="yellow"/>
-        </w:rPr>
-        <w:t>且非主要观点</w:t>
+        <w:t>2</w:t>
       </w:r>
     </w:p>
     <w:p>
@@ -5555,109 +5785,24 @@
         <w:shd w:val="clear" w:color="auto" w:fill="FFFFFF"/>
         <w:spacing w:line="270" w:lineRule="atLeast"/>
         <w:rPr>
-          <w:rFonts w:ascii="Helvetica Neue" w:hAnsi="Helvetica Neue" w:hint="eastAsia"/>
-          <w:color w:val="333333"/>
-        </w:rPr>
-      </w:pPr>
-      <w:r>
-        <w:rPr>
-          <w:rFonts w:ascii="Helvetica Neue" w:hAnsi="Helvetica Neue"/>
-          <w:color w:val="333333"/>
-        </w:rPr>
-        <w:t xml:space="preserve">B. </w:t>
-      </w:r>
-      <w:r>
-        <w:rPr>
-          <w:rFonts w:ascii="Helvetica Neue" w:hAnsi="Helvetica Neue"/>
-          <w:color w:val="FF0000"/>
-        </w:rPr>
-        <w:t>Exploitation of lowland fields was taken over</w:t>
-      </w:r>
-      <w:r>
-        <w:rPr>
-          <w:rFonts w:ascii="Helvetica Neue" w:hAnsi="Helvetica Neue"/>
-          <w:color w:val="333333"/>
-        </w:rPr>
-        <w:t xml:space="preserve"> by villagers and householders after the fields were abandoned by the Romans.</w:t>
-      </w:r>
-      <w:r>
-        <w:rPr>
-          <w:rFonts w:ascii="Helvetica Neue" w:hAnsi="Helvetica Neue" w:hint="eastAsia"/>
-          <w:color w:val="333333"/>
-        </w:rPr>
-        <w:t xml:space="preserve"> </w:t>
-      </w:r>
-      <w:r>
-        <w:rPr>
-          <w:rFonts w:ascii="Helvetica Neue" w:hAnsi="Helvetica Neue" w:hint="eastAsia"/>
-          <w:color w:val="333333"/>
-        </w:rPr>
-        <w:t>低地被放弃，但没有强调接管</w:t>
-      </w:r>
-    </w:p>
-    <w:p>
-      <w:pPr>
-        <w:shd w:val="clear" w:color="auto" w:fill="FFFFFF"/>
-        <w:spacing w:line="270" w:lineRule="atLeast"/>
-        <w:rPr>
-          <w:rFonts w:ascii="Helvetica Neue" w:hAnsi="Helvetica Neue"/>
-          <w:color w:val="333333"/>
-        </w:rPr>
-      </w:pPr>
-      <w:r>
-        <w:rPr>
-          <w:rFonts w:ascii="Helvetica Neue" w:hAnsi="Helvetica Neue"/>
-          <w:color w:val="333333"/>
-        </w:rPr>
-        <w:t>C. Harvesting large trees and preparing their wood for use was difficult with the limited tools available at the time.</w:t>
-      </w:r>
-      <w:r>
-        <w:rPr>
-          <w:rFonts w:ascii="Helvetica Neue" w:hAnsi="Helvetica Neue" w:hint="eastAsia"/>
-          <w:color w:val="333333"/>
-        </w:rPr>
-        <w:t xml:space="preserve"> </w:t>
-      </w:r>
-      <w:r>
-        <w:rPr>
-          <w:rFonts w:ascii="Helvetica Neue" w:hAnsi="Helvetica Neue" w:hint="eastAsia"/>
-          <w:color w:val="333333"/>
-          <w:highlight w:val="yellow"/>
-        </w:rPr>
-        <w:t>工具使得伐木困难</w:t>
-      </w:r>
-      <w:r>
-        <w:rPr>
-          <w:rFonts w:ascii="Helvetica Neue" w:hAnsi="Helvetica Neue" w:hint="eastAsia"/>
-          <w:color w:val="333333"/>
-          <w:highlight w:val="yellow"/>
-        </w:rPr>
-        <w:t xml:space="preserve"> P</w:t>
-      </w:r>
-      <w:r>
-        <w:rPr>
-          <w:rFonts w:ascii="Helvetica Neue" w:hAnsi="Helvetica Neue"/>
-          <w:color w:val="333333"/>
-          <w:highlight w:val="yellow"/>
-        </w:rPr>
-        <w:t>2</w:t>
-      </w:r>
-    </w:p>
-    <w:p>
-      <w:pPr>
-        <w:shd w:val="clear" w:color="auto" w:fill="FFFFFF"/>
-        <w:spacing w:line="270" w:lineRule="atLeast"/>
-        <w:rPr>
-          <w:rFonts w:ascii="Helvetica Neue" w:hAnsi="Helvetica Neue" w:hint="eastAsia"/>
-          <w:color w:val="333333"/>
-        </w:rPr>
-      </w:pPr>
-      <w:r>
-        <w:rPr>
-          <w:rFonts w:ascii="Helvetica Neue" w:hAnsi="Helvetica Neue"/>
-          <w:color w:val="333333"/>
-        </w:rPr>
-        <w:t>D. Use of large, valuable trees was restricted to large-scale projects, for which there was little demand, and transportation costs were high.</w:t>
+          <w:rFonts w:ascii="Helvetica Neue" w:hAnsi="Helvetica Neue"/>
+          <w:color w:val="333333"/>
+        </w:rPr>
+      </w:pPr>
+      <w:r>
+        <w:rPr>
+          <w:rFonts w:ascii="Helvetica Neue" w:hAnsi="Helvetica Neue"/>
+          <w:color w:val="333333"/>
+          <w:highlight w:val="green"/>
+        </w:rPr>
+        <w:t>D. Use of</w:t>
+      </w:r>
+      <w:r>
+        <w:rPr>
+          <w:rFonts w:ascii="Helvetica Neue" w:hAnsi="Helvetica Neue"/>
+          <w:color w:val="333333"/>
+        </w:rPr>
+        <w:t xml:space="preserve"> large, valuable trees was restricted to large-scale projects, for which there was little demand, and transportation costs were high.</w:t>
       </w:r>
       <w:r>
         <w:rPr>
@@ -5734,7 +5879,7 @@
         <w:shd w:val="clear" w:color="auto" w:fill="FFFFFF"/>
         <w:spacing w:line="270" w:lineRule="atLeast"/>
         <w:rPr>
-          <w:rFonts w:ascii="Helvetica Neue" w:hAnsi="Helvetica Neue" w:hint="eastAsia"/>
+          <w:rFonts w:ascii="Helvetica Neue" w:hAnsi="Helvetica Neue"/>
           <w:color w:val="333333"/>
         </w:rPr>
       </w:pPr>
@@ -5894,7 +6039,7 @@
           <w:rFonts w:ascii="Helvetica Neue" w:hAnsi="Helvetica Neue"/>
           <w:color w:val="000000"/>
         </w:rPr>
-        <w:t xml:space="preserve">This view was based on evidence of extensive fields inland. It was also consistent with reports from early European explorers, including Henry Hudson who sailed for the Dutch, </w:t>
+        <w:t xml:space="preserve">This view was based </w:t>
       </w:r>
       <w:r>
         <w:rPr>
@@ -5902,7 +6047,7 @@
           <w:color w:val="000000"/>
         </w:rPr>
         <w:lastRenderedPageBreak/>
-        <w:t>about trading with Native Americans for "Turkish wheat," the explorers' term for maize</w:t>
+        <w:t>on evidence of extensive fields inland. It was also consistent with reports from early European explorers, including Henry Hudson who sailed for the Dutch, about trading with Native Americans for "Turkish wheat," the explorers' term for maize</w:t>
       </w:r>
       <w:commentRangeStart w:id="10"/>
       <w:r>
@@ -6276,7 +6421,7 @@
         <w:spacing w:line="345" w:lineRule="atLeast"/>
         <w:jc w:val="both"/>
         <w:rPr>
-          <w:rFonts w:ascii="Helvetica Neue" w:hAnsi="Helvetica Neue" w:hint="eastAsia"/>
+          <w:rFonts w:ascii="Helvetica Neue" w:hAnsi="Helvetica Neue"/>
           <w:color w:val="000000"/>
         </w:rPr>
       </w:pPr>
@@ -6287,7 +6432,7 @@
         <w:spacing w:line="345" w:lineRule="atLeast"/>
         <w:jc w:val="both"/>
         <w:rPr>
-          <w:rFonts w:ascii="Helvetica Neue" w:hAnsi="Helvetica Neue" w:hint="eastAsia"/>
+          <w:rFonts w:ascii="Helvetica Neue" w:hAnsi="Helvetica Neue"/>
           <w:color w:val="000000"/>
         </w:rPr>
       </w:pPr>
@@ -6391,6 +6536,7 @@
           <w:rFonts w:ascii="Helvetica Neue" w:hAnsi="Helvetica Neue"/>
           <w:color w:val="000000"/>
         </w:rPr>
+        <w:lastRenderedPageBreak/>
         <w:t xml:space="preserve">Beginning in late </w:t>
       </w:r>
       <w:commentRangeEnd w:id="13"/>
@@ -6405,15 +6551,7 @@
           <w:rFonts w:ascii="Helvetica Neue" w:hAnsi="Helvetica Neue"/>
           <w:color w:val="000000"/>
         </w:rPr>
-        <w:t xml:space="preserve">April, Lenape men cleared a plot of land by cutting down the large trees and burning the vegetation. Burning fertilized the soil with ash, which promoted plant growth by changing the soil chemistry from acidic to </w:t>
-      </w:r>
-      <w:r>
-        <w:rPr>
-          <w:rFonts w:ascii="Helvetica Neue" w:hAnsi="Helvetica Neue"/>
-          <w:color w:val="000000"/>
-        </w:rPr>
-        <w:lastRenderedPageBreak/>
-        <w:t xml:space="preserve">alkaline, releasing more nutrients. In early May the women created mounds and planted maize kernels saved from the year before. A few weeks later, they planted beans along the sides of the mounds and squash between them. </w:t>
+        <w:t xml:space="preserve">April, Lenape men cleared a plot of land by cutting down the large trees and burning the vegetation. Burning fertilized the soil with ash, which promoted plant growth by changing the soil chemistry from acidic to alkaline, releasing more nutrients. In early May the women created mounds and planted maize kernels saved from the year before. A few weeks later, they planted beans along the sides of the mounds and squash between them. </w:t>
       </w:r>
       <w:r>
         <w:rPr>
@@ -6646,6 +6784,7 @@
           <w:rFonts w:ascii="Helvetica Neue" w:hAnsi="Helvetica Neue"/>
           <w:color w:val="000000"/>
         </w:rPr>
+        <w:lastRenderedPageBreak/>
         <w:t>developed</w:t>
       </w:r>
     </w:p>
@@ -6680,36 +6819,414 @@
           <w:rFonts w:ascii="Helvetica Neue" w:hAnsi="Helvetica Neue"/>
           <w:color w:val="FF0000"/>
         </w:rPr>
+        <w:t>examined</w:t>
+      </w:r>
+    </w:p>
+    <w:p>
+      <w:pPr>
+        <w:shd w:val="clear" w:color="auto" w:fill="FFFFFF"/>
+        <w:spacing w:line="420" w:lineRule="atLeast"/>
+        <w:rPr>
+          <w:rFonts w:ascii="Helvetica Neue" w:hAnsi="Helvetica Neue"/>
+          <w:color w:val="000000"/>
+        </w:rPr>
+      </w:pPr>
+      <w:r>
+        <w:rPr>
+          <w:rFonts w:ascii="Helvetica Neue" w:hAnsi="Helvetica Neue"/>
+          <w:color w:val="000000"/>
+          <w:highlight w:val="green"/>
+        </w:rPr>
+        <w:t>confirmed</w:t>
+      </w:r>
+    </w:p>
+    <w:p>
+      <w:pPr>
+        <w:rPr>
+          <w:rFonts w:ascii="Helvetica Neue" w:hAnsi="Helvetica Neue"/>
+          <w:color w:val="000000"/>
+        </w:rPr>
+      </w:pPr>
+    </w:p>
+    <w:p>
+      <w:pPr>
+        <w:shd w:val="clear" w:color="auto" w:fill="FFFFFF"/>
+        <w:spacing w:after="75"/>
+        <w:rPr>
+          <w:rFonts w:ascii="Helvetica Neue" w:hAnsi="Helvetica Neue"/>
+          <w:b/>
+          <w:bCs/>
+          <w:color w:val="000000"/>
+        </w:rPr>
+      </w:pPr>
+      <w:r>
+        <w:rPr>
+          <w:rFonts w:ascii="Helvetica Neue" w:hAnsi="Helvetica Neue"/>
+          <w:b/>
+          <w:bCs/>
+          <w:color w:val="000000"/>
+        </w:rPr>
+        <w:t>According to paragraph 1, Ceci considered all of the following facts to be evidence that maize was less important on the coast EXCEPT</w:t>
+      </w:r>
+    </w:p>
+    <w:p>
+      <w:pPr>
+        <w:shd w:val="clear" w:color="auto" w:fill="FFFFFF"/>
+        <w:spacing w:line="420" w:lineRule="atLeast"/>
+        <w:rPr>
+          <w:rFonts w:ascii="Helvetica Neue" w:hAnsi="Helvetica Neue"/>
+          <w:color w:val="000000"/>
+        </w:rPr>
+      </w:pPr>
+      <w:r>
+        <w:rPr>
+          <w:rFonts w:ascii="Helvetica Neue" w:hAnsi="Helvetica Neue"/>
+          <w:color w:val="000000"/>
+        </w:rPr>
+        <w:t>Old fire pits along the coast reveal few traces of seeds and maize</w:t>
+      </w:r>
+    </w:p>
+    <w:p>
+      <w:pPr>
+        <w:shd w:val="clear" w:color="auto" w:fill="FFFFFF"/>
+        <w:spacing w:line="420" w:lineRule="atLeast"/>
+        <w:rPr>
+          <w:rFonts w:ascii="Helvetica Neue" w:hAnsi="Helvetica Neue"/>
+          <w:color w:val="000000"/>
+        </w:rPr>
+      </w:pPr>
+      <w:r>
+        <w:rPr>
+          <w:rFonts w:ascii="Helvetica Neue" w:hAnsi="Helvetica Neue"/>
+          <w:color w:val="000000"/>
+        </w:rPr>
+        <w:t>The soil along the coast was not well suited for growing maize</w:t>
+      </w:r>
+    </w:p>
+    <w:p>
+      <w:pPr>
+        <w:shd w:val="clear" w:color="auto" w:fill="FFFFFF"/>
+        <w:spacing w:line="420" w:lineRule="atLeast"/>
+        <w:rPr>
+          <w:rFonts w:ascii="Helvetica Neue" w:hAnsi="Helvetica Neue"/>
+          <w:color w:val="000000"/>
+        </w:rPr>
+      </w:pPr>
+      <w:r>
+        <w:rPr>
+          <w:rFonts w:ascii="Helvetica Neue" w:hAnsi="Helvetica Neue"/>
+          <w:color w:val="000000"/>
+        </w:rPr>
+        <w:t>Many different sources of food were available on the coast</w:t>
+      </w:r>
+    </w:p>
+    <w:p>
+      <w:pPr>
+        <w:shd w:val="clear" w:color="auto" w:fill="FFFFFF"/>
+        <w:spacing w:line="420" w:lineRule="atLeast"/>
+        <w:rPr>
+          <w:rFonts w:ascii="Helvetica Neue" w:hAnsi="Helvetica Neue"/>
+          <w:color w:val="000000"/>
+        </w:rPr>
+      </w:pPr>
+      <w:r>
+        <w:rPr>
+          <w:rFonts w:ascii="Helvetica Neue" w:hAnsi="Helvetica Neue"/>
+          <w:color w:val="000000"/>
+        </w:rPr>
+        <w:t>Maize fields on the coast were frequently flooded with water</w:t>
+      </w:r>
+    </w:p>
+    <w:p>
+      <w:pPr>
+        <w:shd w:val="clear" w:color="auto" w:fill="FFFFFF"/>
+        <w:spacing w:line="420" w:lineRule="atLeast"/>
+        <w:rPr>
+          <w:rFonts w:ascii="Helvetica Neue" w:hAnsi="Helvetica Neue"/>
+          <w:color w:val="000000"/>
+        </w:rPr>
+      </w:pPr>
+    </w:p>
+    <w:p>
+      <w:pPr>
+        <w:shd w:val="clear" w:color="auto" w:fill="FFFFFF"/>
+        <w:spacing w:after="75"/>
+        <w:rPr>
+          <w:rFonts w:ascii="Helvetica Neue" w:hAnsi="Helvetica Neue"/>
+          <w:b/>
+          <w:bCs/>
+          <w:color w:val="000000"/>
+        </w:rPr>
+      </w:pPr>
+      <w:r>
+        <w:rPr>
+          <w:rFonts w:ascii="Helvetica Neue" w:hAnsi="Helvetica Neue"/>
+          <w:b/>
+          <w:bCs/>
+          <w:color w:val="000000"/>
+        </w:rPr>
+        <w:t>According to paragraph 2, the modern crop model was not an accurate simulation of Lenape agriculture because</w:t>
+      </w:r>
+    </w:p>
+    <w:p>
+      <w:pPr>
+        <w:shd w:val="clear" w:color="auto" w:fill="FFFFFF"/>
+        <w:spacing w:line="420" w:lineRule="atLeast"/>
+        <w:rPr>
+          <w:rFonts w:ascii="Helvetica Neue" w:hAnsi="Helvetica Neue"/>
+          <w:color w:val="000000"/>
+        </w:rPr>
+      </w:pPr>
+      <w:r>
+        <w:rPr>
+          <w:rFonts w:ascii="Helvetica Neue" w:hAnsi="Helvetica Neue"/>
+          <w:color w:val="000000"/>
+        </w:rPr>
+        <w:t>the type of maize used in the model was not the same as Lenape maize</w:t>
+      </w:r>
+    </w:p>
+    <w:p>
+      <w:pPr>
+        <w:shd w:val="clear" w:color="auto" w:fill="FFFFFF"/>
+        <w:spacing w:line="420" w:lineRule="atLeast"/>
+        <w:rPr>
+          <w:rFonts w:ascii="Helvetica Neue" w:hAnsi="Helvetica Neue"/>
+          <w:color w:val="000000"/>
+        </w:rPr>
+      </w:pPr>
+      <w:r>
+        <w:rPr>
+          <w:rFonts w:ascii="Helvetica Neue" w:hAnsi="Helvetica Neue"/>
+          <w:color w:val="000000"/>
+        </w:rPr>
+        <w:t>the soil on Manhattan was different from the soil types used by the Lenape</w:t>
+      </w:r>
+    </w:p>
+    <w:p>
+      <w:pPr>
+        <w:shd w:val="clear" w:color="auto" w:fill="FFFFFF"/>
+        <w:spacing w:line="420" w:lineRule="atLeast"/>
+        <w:rPr>
+          <w:rFonts w:ascii="Helvetica Neue" w:hAnsi="Helvetica Neue"/>
+          <w:color w:val="000000"/>
+        </w:rPr>
+      </w:pPr>
+      <w:r>
+        <w:rPr>
+          <w:rFonts w:ascii="Helvetica Neue" w:hAnsi="Helvetica Neue"/>
+          <w:color w:val="000000"/>
+        </w:rPr>
+        <w:t>the model used only one type of plant but the Lenape used several types of plants</w:t>
+      </w:r>
+    </w:p>
+    <w:p>
+      <w:pPr>
+        <w:shd w:val="clear" w:color="auto" w:fill="FFFFFF"/>
+        <w:spacing w:line="420" w:lineRule="atLeast"/>
+        <w:rPr>
+          <w:rFonts w:ascii="Helvetica Neue" w:hAnsi="Helvetica Neue"/>
+          <w:color w:val="000000"/>
+        </w:rPr>
+      </w:pPr>
+      <w:r>
+        <w:rPr>
+          <w:rFonts w:ascii="Helvetica Neue" w:hAnsi="Helvetica Neue"/>
+          <w:color w:val="000000"/>
+        </w:rPr>
+        <w:t>the climate of Manhattan is no longer appropriate for growing Lenape maize</w:t>
+      </w:r>
+    </w:p>
+    <w:p>
+      <w:pPr>
+        <w:shd w:val="clear" w:color="auto" w:fill="FFFFFF"/>
+        <w:spacing w:line="420" w:lineRule="atLeast"/>
+        <w:rPr>
+          <w:rFonts w:ascii="Helvetica Neue" w:hAnsi="Helvetica Neue"/>
+          <w:color w:val="000000"/>
+        </w:rPr>
+      </w:pPr>
+    </w:p>
+    <w:p>
+      <w:pPr>
+        <w:shd w:val="clear" w:color="auto" w:fill="FFFFFF"/>
+        <w:spacing w:after="75"/>
+        <w:rPr>
+          <w:rFonts w:ascii="Helvetica Neue" w:hAnsi="Helvetica Neue"/>
+          <w:b/>
+          <w:bCs/>
+          <w:color w:val="000000"/>
+        </w:rPr>
+      </w:pPr>
+      <w:r>
+        <w:rPr>
+          <w:rFonts w:ascii="Helvetica Neue" w:hAnsi="Helvetica Neue"/>
+          <w:b/>
+          <w:bCs/>
+          <w:color w:val="000000"/>
+        </w:rPr>
+        <w:t>Which of the sentences below best expresses the essential information in the highlighted sentence in the passage? Incorrect choices change the meaning in important ways or leave out essential information</w:t>
+      </w:r>
+    </w:p>
+    <w:p>
+      <w:pPr>
+        <w:shd w:val="clear" w:color="auto" w:fill="FFFFFF"/>
+        <w:spacing w:line="420" w:lineRule="atLeast"/>
+        <w:rPr>
+          <w:rFonts w:ascii="Helvetica Neue" w:hAnsi="Helvetica Neue"/>
+          <w:color w:val="000000"/>
+        </w:rPr>
+      </w:pPr>
+      <w:r>
+        <w:rPr>
+          <w:rFonts w:ascii="Helvetica Neue" w:hAnsi="Helvetica Neue"/>
+          <w:color w:val="000000"/>
+        </w:rPr>
+        <w:t>The maize relied on the stems to reach the sun and on the beans for fertilizer</w:t>
+      </w:r>
+    </w:p>
+    <w:p>
+      <w:pPr>
+        <w:shd w:val="clear" w:color="auto" w:fill="FFFFFF"/>
+        <w:spacing w:line="420" w:lineRule="atLeast"/>
+        <w:rPr>
+          <w:rFonts w:ascii="Helvetica Neue" w:hAnsi="Helvetica Neue"/>
+          <w:color w:val="000000"/>
+        </w:rPr>
+      </w:pPr>
+      <w:r>
+        <w:rPr>
+          <w:rFonts w:ascii="Helvetica Neue" w:hAnsi="Helvetica Neue"/>
+          <w:color w:val="000000"/>
+        </w:rPr>
+        <w:t>The beans turned atmospheric nitrogen into a natural fertilizer for the maize</w:t>
+      </w:r>
+    </w:p>
+    <w:p>
+      <w:pPr>
+        <w:shd w:val="clear" w:color="auto" w:fill="FFFFFF"/>
+        <w:spacing w:line="420" w:lineRule="atLeast"/>
+        <w:rPr>
+          <w:rFonts w:ascii="Helvetica Neue" w:hAnsi="Helvetica Neue"/>
+          <w:color w:val="000000"/>
+        </w:rPr>
+      </w:pPr>
+      <w:r>
+        <w:rPr>
+          <w:rFonts w:ascii="Helvetica Neue" w:hAnsi="Helvetica Neue"/>
+          <w:color w:val="000000"/>
+        </w:rPr>
+        <w:t>The beans and maize were able to grow in areas with sun and natural fertilizer</w:t>
+      </w:r>
+    </w:p>
+    <w:p>
+      <w:pPr>
+        <w:shd w:val="clear" w:color="auto" w:fill="FFFFFF"/>
+        <w:spacing w:line="420" w:lineRule="atLeast"/>
+        <w:rPr>
+          <w:rFonts w:ascii="Helvetica Neue" w:hAnsi="Helvetica Neue"/>
+          <w:color w:val="000000"/>
+        </w:rPr>
+      </w:pPr>
+      <w:r>
+        <w:rPr>
+          <w:rFonts w:ascii="Helvetica Neue" w:hAnsi="Helvetica Neue"/>
+          <w:color w:val="000000"/>
+        </w:rPr>
+        <w:t>The maize helped the beans reach the sun while the beans fertilized the maize</w:t>
+      </w:r>
+    </w:p>
+    <w:p/>
+    <w:p>
+      <w:pPr>
+        <w:shd w:val="clear" w:color="auto" w:fill="FFFFFF"/>
+        <w:spacing w:after="75"/>
+        <w:rPr>
+          <w:rFonts w:ascii="Helvetica Neue" w:hAnsi="Helvetica Neue"/>
+          <w:b/>
+          <w:bCs/>
+          <w:color w:val="000000"/>
+        </w:rPr>
+      </w:pPr>
+      <w:r>
+        <w:rPr>
+          <w:rFonts w:ascii="Helvetica Neue" w:hAnsi="Helvetica Neue"/>
+          <w:b/>
+          <w:bCs/>
+          <w:color w:val="000000"/>
+        </w:rPr>
+        <w:t>According to paragraph 3, men made which of the following contributions to Lenape plant cultivation?</w:t>
+      </w:r>
+    </w:p>
+    <w:p>
+      <w:pPr>
+        <w:shd w:val="clear" w:color="auto" w:fill="FFFFFF"/>
+        <w:spacing w:line="420" w:lineRule="atLeast"/>
+        <w:rPr>
+          <w:rFonts w:ascii="Helvetica Neue" w:hAnsi="Helvetica Neue"/>
+          <w:color w:val="000000"/>
+        </w:rPr>
+      </w:pPr>
+      <w:r>
+        <w:rPr>
+          <w:rFonts w:ascii="Helvetica Neue" w:hAnsi="Helvetica Neue"/>
+          <w:color w:val="000000"/>
+        </w:rPr>
+        <w:t>They planted maize seeds</w:t>
+      </w:r>
+    </w:p>
+    <w:p>
+      <w:pPr>
+        <w:shd w:val="clear" w:color="auto" w:fill="FFFFFF"/>
+        <w:spacing w:line="420" w:lineRule="atLeast"/>
+        <w:rPr>
+          <w:rFonts w:ascii="Helvetica Neue" w:hAnsi="Helvetica Neue"/>
+          <w:color w:val="000000"/>
+        </w:rPr>
+      </w:pPr>
+      <w:r>
+        <w:rPr>
+          <w:rFonts w:ascii="Helvetica Neue" w:hAnsi="Helvetica Neue"/>
+          <w:color w:val="000000"/>
+        </w:rPr>
+        <w:t>They created ash that fertilized the soil</w:t>
+      </w:r>
+    </w:p>
+    <w:p>
+      <w:pPr>
+        <w:shd w:val="clear" w:color="auto" w:fill="FFFFFF"/>
+        <w:spacing w:line="420" w:lineRule="atLeast"/>
+        <w:rPr>
+          <w:rFonts w:ascii="Helvetica Neue" w:hAnsi="Helvetica Neue"/>
+          <w:color w:val="000000"/>
+        </w:rPr>
+      </w:pPr>
+      <w:r>
+        <w:rPr>
+          <w:rFonts w:ascii="Helvetica Neue" w:hAnsi="Helvetica Neue"/>
+          <w:color w:val="000000"/>
+        </w:rPr>
+        <w:t>They removed weeds from around the crops</w:t>
+      </w:r>
+    </w:p>
+    <w:p>
+      <w:pPr>
+        <w:shd w:val="clear" w:color="auto" w:fill="FFFFFF"/>
+        <w:spacing w:line="420" w:lineRule="atLeast"/>
+        <w:rPr>
+          <w:rFonts w:ascii="Helvetica Neue" w:hAnsi="Helvetica Neue"/>
+          <w:color w:val="000000"/>
+        </w:rPr>
+      </w:pPr>
+      <w:r>
+        <w:rPr>
+          <w:rFonts w:ascii="Helvetica Neue" w:hAnsi="Helvetica Neue"/>
+          <w:color w:val="000000"/>
+        </w:rPr>
         <w:lastRenderedPageBreak/>
-        <w:t>examined</w:t>
-      </w:r>
-    </w:p>
-    <w:p>
-      <w:pPr>
-        <w:shd w:val="clear" w:color="auto" w:fill="FFFFFF"/>
-        <w:spacing w:line="420" w:lineRule="atLeast"/>
-        <w:rPr>
-          <w:rFonts w:ascii="Helvetica Neue" w:hAnsi="Helvetica Neue"/>
-          <w:color w:val="000000"/>
-        </w:rPr>
-      </w:pPr>
-      <w:r>
-        <w:rPr>
-          <w:rFonts w:ascii="Helvetica Neue" w:hAnsi="Helvetica Neue"/>
-          <w:color w:val="000000"/>
-          <w:highlight w:val="green"/>
-        </w:rPr>
-        <w:t>confirmed</w:t>
-      </w:r>
-    </w:p>
-    <w:p>
-      <w:pPr>
-        <w:rPr>
-          <w:rFonts w:ascii="Helvetica Neue" w:hAnsi="Helvetica Neue"/>
-          <w:color w:val="000000"/>
-        </w:rPr>
-      </w:pPr>
-    </w:p>
+        <w:t>They improved soil moisture with irrigation</w:t>
+      </w:r>
+    </w:p>
+    <w:p/>
     <w:p>
       <w:pPr>
         <w:shd w:val="clear" w:color="auto" w:fill="FFFFFF"/>
@@ -6728,75 +7245,75 @@
           <w:bCs/>
           <w:color w:val="000000"/>
         </w:rPr>
-        <w:t>According to paragraph 1, Ceci considered all of the following facts to be evidence that maize was less important on the coast EXCEPT</w:t>
-      </w:r>
-    </w:p>
-    <w:p>
-      <w:pPr>
-        <w:shd w:val="clear" w:color="auto" w:fill="FFFFFF"/>
-        <w:spacing w:line="420" w:lineRule="atLeast"/>
-        <w:rPr>
-          <w:rFonts w:ascii="Helvetica Neue" w:hAnsi="Helvetica Neue"/>
-          <w:color w:val="000000"/>
-        </w:rPr>
-      </w:pPr>
-      <w:r>
-        <w:rPr>
-          <w:rFonts w:ascii="Helvetica Neue" w:hAnsi="Helvetica Neue"/>
-          <w:color w:val="000000"/>
-        </w:rPr>
-        <w:t>Old fire pits along the coast reveal few traces of seeds and maize</w:t>
-      </w:r>
-    </w:p>
-    <w:p>
-      <w:pPr>
-        <w:shd w:val="clear" w:color="auto" w:fill="FFFFFF"/>
-        <w:spacing w:line="420" w:lineRule="atLeast"/>
-        <w:rPr>
-          <w:rFonts w:ascii="Helvetica Neue" w:hAnsi="Helvetica Neue"/>
-          <w:color w:val="000000"/>
-        </w:rPr>
-      </w:pPr>
-      <w:r>
-        <w:rPr>
-          <w:rFonts w:ascii="Helvetica Neue" w:hAnsi="Helvetica Neue"/>
-          <w:color w:val="000000"/>
-        </w:rPr>
-        <w:t>The soil along the coast was not well suited for growing maize</w:t>
-      </w:r>
-    </w:p>
-    <w:p>
-      <w:pPr>
-        <w:shd w:val="clear" w:color="auto" w:fill="FFFFFF"/>
-        <w:spacing w:line="420" w:lineRule="atLeast"/>
-        <w:rPr>
-          <w:rFonts w:ascii="Helvetica Neue" w:hAnsi="Helvetica Neue"/>
-          <w:color w:val="000000"/>
-        </w:rPr>
-      </w:pPr>
-      <w:r>
-        <w:rPr>
-          <w:rFonts w:ascii="Helvetica Neue" w:hAnsi="Helvetica Neue"/>
-          <w:color w:val="000000"/>
-        </w:rPr>
-        <w:t>Many different sources of food were available on the coast</w:t>
-      </w:r>
-    </w:p>
-    <w:p>
-      <w:pPr>
-        <w:shd w:val="clear" w:color="auto" w:fill="FFFFFF"/>
-        <w:spacing w:line="420" w:lineRule="atLeast"/>
-        <w:rPr>
-          <w:rFonts w:ascii="Helvetica Neue" w:hAnsi="Helvetica Neue"/>
-          <w:color w:val="000000"/>
-        </w:rPr>
-      </w:pPr>
-      <w:r>
-        <w:rPr>
-          <w:rFonts w:ascii="Helvetica Neue" w:hAnsi="Helvetica Neue"/>
-          <w:color w:val="000000"/>
-        </w:rPr>
-        <w:t>Maize fields on the coast were frequently flooded with water</w:t>
+        <w:t>Paragraph 3 suggests which of the following about squash grown on Lenape fields?</w:t>
+      </w:r>
+    </w:p>
+    <w:p>
+      <w:pPr>
+        <w:shd w:val="clear" w:color="auto" w:fill="FFFFFF"/>
+        <w:spacing w:line="420" w:lineRule="atLeast"/>
+        <w:rPr>
+          <w:rFonts w:ascii="Helvetica Neue" w:hAnsi="Helvetica Neue"/>
+          <w:color w:val="000000"/>
+        </w:rPr>
+      </w:pPr>
+      <w:r>
+        <w:rPr>
+          <w:rFonts w:ascii="Helvetica Neue" w:hAnsi="Helvetica Neue"/>
+          <w:color w:val="000000"/>
+        </w:rPr>
+        <w:t>It increased the availability of water for the maize and beans</w:t>
+      </w:r>
+    </w:p>
+    <w:p>
+      <w:pPr>
+        <w:shd w:val="clear" w:color="auto" w:fill="FFFFFF"/>
+        <w:spacing w:line="420" w:lineRule="atLeast"/>
+        <w:rPr>
+          <w:rFonts w:ascii="Helvetica Neue" w:hAnsi="Helvetica Neue"/>
+          <w:color w:val="000000"/>
+        </w:rPr>
+      </w:pPr>
+      <w:r>
+        <w:rPr>
+          <w:rFonts w:ascii="Helvetica Neue" w:hAnsi="Helvetica Neue"/>
+          <w:color w:val="000000"/>
+        </w:rPr>
+        <w:t>It was usually planted in late April</w:t>
+      </w:r>
+    </w:p>
+    <w:p>
+      <w:pPr>
+        <w:shd w:val="clear" w:color="auto" w:fill="FFFFFF"/>
+        <w:spacing w:line="420" w:lineRule="atLeast"/>
+        <w:rPr>
+          <w:rFonts w:ascii="Helvetica Neue" w:hAnsi="Helvetica Neue"/>
+          <w:color w:val="000000"/>
+        </w:rPr>
+      </w:pPr>
+      <w:r>
+        <w:rPr>
+          <w:rFonts w:ascii="Helvetica Neue" w:hAnsi="Helvetica Neue"/>
+          <w:color w:val="000000"/>
+        </w:rPr>
+        <w:t>It led to increasing weeds</w:t>
+      </w:r>
+    </w:p>
+    <w:p>
+      <w:pPr>
+        <w:shd w:val="clear" w:color="auto" w:fill="FFFFFF"/>
+        <w:spacing w:line="420" w:lineRule="atLeast"/>
+        <w:rPr>
+          <w:rFonts w:ascii="Helvetica Neue" w:hAnsi="Helvetica Neue"/>
+          <w:color w:val="000000"/>
+        </w:rPr>
+      </w:pPr>
+      <w:r>
+        <w:rPr>
+          <w:rFonts w:ascii="Helvetica Neue" w:hAnsi="Helvetica Neue"/>
+          <w:color w:val="000000"/>
+        </w:rPr>
+        <w:t>It needed irrigation in order to grow successfully</w:t>
       </w:r>
     </w:p>
     <w:p>
@@ -6827,86 +7344,76 @@
           <w:bCs/>
           <w:color w:val="000000"/>
         </w:rPr>
-        <w:t>According to paragraph 2, the modern crop model was not an accurate simulation of Lenape agriculture because</w:t>
-      </w:r>
-    </w:p>
-    <w:p>
-      <w:pPr>
-        <w:shd w:val="clear" w:color="auto" w:fill="FFFFFF"/>
-        <w:spacing w:line="420" w:lineRule="atLeast"/>
-        <w:rPr>
-          <w:rFonts w:ascii="Helvetica Neue" w:hAnsi="Helvetica Neue"/>
-          <w:color w:val="000000"/>
-        </w:rPr>
-      </w:pPr>
-      <w:r>
-        <w:rPr>
-          <w:rFonts w:ascii="Helvetica Neue" w:hAnsi="Helvetica Neue"/>
-          <w:color w:val="000000"/>
-        </w:rPr>
-        <w:t>the type of maize used in the model was not the same as Lenape maize</w:t>
-      </w:r>
-    </w:p>
-    <w:p>
-      <w:pPr>
-        <w:shd w:val="clear" w:color="auto" w:fill="FFFFFF"/>
-        <w:spacing w:line="420" w:lineRule="atLeast"/>
-        <w:rPr>
-          <w:rFonts w:ascii="Helvetica Neue" w:hAnsi="Helvetica Neue"/>
-          <w:color w:val="000000"/>
-        </w:rPr>
-      </w:pPr>
-      <w:r>
-        <w:rPr>
-          <w:rFonts w:ascii="Helvetica Neue" w:hAnsi="Helvetica Neue"/>
-          <w:color w:val="000000"/>
-        </w:rPr>
-        <w:t>the soil on Manhattan was different from the soil types used by the Lenape</w:t>
-      </w:r>
-    </w:p>
-    <w:p>
-      <w:pPr>
-        <w:shd w:val="clear" w:color="auto" w:fill="FFFFFF"/>
-        <w:spacing w:line="420" w:lineRule="atLeast"/>
-        <w:rPr>
-          <w:rFonts w:ascii="Helvetica Neue" w:hAnsi="Helvetica Neue"/>
-          <w:color w:val="000000"/>
-        </w:rPr>
-      </w:pPr>
-      <w:r>
-        <w:rPr>
-          <w:rFonts w:ascii="Helvetica Neue" w:hAnsi="Helvetica Neue"/>
-          <w:color w:val="000000"/>
-        </w:rPr>
-        <w:t>the model used only one type of plant but the Lenape used several types of plants</w:t>
-      </w:r>
-    </w:p>
-    <w:p>
-      <w:pPr>
-        <w:shd w:val="clear" w:color="auto" w:fill="FFFFFF"/>
-        <w:spacing w:line="420" w:lineRule="atLeast"/>
-        <w:rPr>
-          <w:rFonts w:ascii="Helvetica Neue" w:hAnsi="Helvetica Neue"/>
-          <w:color w:val="000000"/>
-        </w:rPr>
-      </w:pPr>
-      <w:r>
-        <w:rPr>
-          <w:rFonts w:ascii="Helvetica Neue" w:hAnsi="Helvetica Neue"/>
-          <w:color w:val="000000"/>
-        </w:rPr>
-        <w:t>the climate of Manhattan is no longer appropriate for growing Lenape maize</w:t>
-      </w:r>
-    </w:p>
-    <w:p>
-      <w:pPr>
-        <w:shd w:val="clear" w:color="auto" w:fill="FFFFFF"/>
-        <w:spacing w:line="420" w:lineRule="atLeast"/>
-        <w:rPr>
-          <w:rFonts w:ascii="Helvetica Neue" w:hAnsi="Helvetica Neue"/>
-          <w:color w:val="000000"/>
-        </w:rPr>
-      </w:pPr>
+        <w:t>In paragraph 5, why does the author mention that Lenape women had to perform tasks other than gardening?</w:t>
+      </w:r>
+    </w:p>
+    <w:p>
+      <w:pPr>
+        <w:shd w:val="clear" w:color="auto" w:fill="FFFFFF"/>
+        <w:spacing w:line="420" w:lineRule="atLeast"/>
+        <w:rPr>
+          <w:rFonts w:ascii="Helvetica Neue" w:hAnsi="Helvetica Neue"/>
+          <w:color w:val="000000"/>
+        </w:rPr>
+      </w:pPr>
+      <w:r>
+        <w:rPr>
+          <w:rFonts w:ascii="Helvetica Neue" w:hAnsi="Helvetica Neue"/>
+          <w:color w:val="000000"/>
+        </w:rPr>
+        <w:t>To suggest that Lenape women were treated unfairly</w:t>
+      </w:r>
+    </w:p>
+    <w:p>
+      <w:pPr>
+        <w:shd w:val="clear" w:color="auto" w:fill="FFFFFF"/>
+        <w:spacing w:line="420" w:lineRule="atLeast"/>
+        <w:rPr>
+          <w:rFonts w:ascii="Helvetica Neue" w:hAnsi="Helvetica Neue"/>
+          <w:color w:val="000000"/>
+        </w:rPr>
+      </w:pPr>
+      <w:r>
+        <w:rPr>
+          <w:rFonts w:ascii="Helvetica Neue" w:hAnsi="Helvetica Neue"/>
+          <w:color w:val="000000"/>
+        </w:rPr>
+        <w:t>To challenge the belief that gardening was a woman’s responsibility</w:t>
+      </w:r>
+    </w:p>
+    <w:p>
+      <w:pPr>
+        <w:shd w:val="clear" w:color="auto" w:fill="FFFFFF"/>
+        <w:spacing w:line="420" w:lineRule="atLeast"/>
+        <w:rPr>
+          <w:rFonts w:ascii="Helvetica Neue" w:hAnsi="Helvetica Neue"/>
+          <w:color w:val="000000"/>
+        </w:rPr>
+      </w:pPr>
+      <w:r>
+        <w:rPr>
+          <w:rFonts w:ascii="Helvetica Neue" w:hAnsi="Helvetica Neue"/>
+          <w:color w:val="000000"/>
+        </w:rPr>
+        <w:t>To provide a factor that limited the total amount of food grown on Lenape fields</w:t>
+      </w:r>
+    </w:p>
+    <w:p>
+      <w:pPr>
+        <w:shd w:val="clear" w:color="auto" w:fill="FFFFFF"/>
+        <w:spacing w:line="420" w:lineRule="atLeast"/>
+        <w:rPr>
+          <w:rFonts w:ascii="Helvetica Neue" w:hAnsi="Helvetica Neue"/>
+          <w:color w:val="000000"/>
+        </w:rPr>
+      </w:pPr>
+      <w:r>
+        <w:rPr>
+          <w:rFonts w:ascii="Helvetica Neue" w:hAnsi="Helvetica Neue"/>
+          <w:color w:val="000000"/>
+        </w:rPr>
+        <w:t>To demonstrate that Lenape gardening was similar to modern gardening</w:t>
+      </w:r>
     </w:p>
     <w:p>
       <w:pPr>
@@ -6919,375 +7426,6 @@
           <w:color w:val="000000"/>
         </w:rPr>
       </w:pPr>
-      <w:r>
-        <w:rPr>
-          <w:rFonts w:ascii="Helvetica Neue" w:hAnsi="Helvetica Neue"/>
-          <w:b/>
-          <w:bCs/>
-          <w:color w:val="000000"/>
-        </w:rPr>
-        <w:t>Which of the sentences below best expresses the essential information in the highlighted sentence in the passage? Incorrect choices change the meaning in important ways or leave out essential information</w:t>
-      </w:r>
-    </w:p>
-    <w:p>
-      <w:pPr>
-        <w:shd w:val="clear" w:color="auto" w:fill="FFFFFF"/>
-        <w:spacing w:line="420" w:lineRule="atLeast"/>
-        <w:rPr>
-          <w:rFonts w:ascii="Helvetica Neue" w:hAnsi="Helvetica Neue"/>
-          <w:color w:val="000000"/>
-        </w:rPr>
-      </w:pPr>
-      <w:r>
-        <w:rPr>
-          <w:rFonts w:ascii="Helvetica Neue" w:hAnsi="Helvetica Neue"/>
-          <w:color w:val="000000"/>
-        </w:rPr>
-        <w:t>The maize relied on the stems to reach the sun and on the beans for fertilizer</w:t>
-      </w:r>
-    </w:p>
-    <w:p>
-      <w:pPr>
-        <w:shd w:val="clear" w:color="auto" w:fill="FFFFFF"/>
-        <w:spacing w:line="420" w:lineRule="atLeast"/>
-        <w:rPr>
-          <w:rFonts w:ascii="Helvetica Neue" w:hAnsi="Helvetica Neue"/>
-          <w:color w:val="000000"/>
-        </w:rPr>
-      </w:pPr>
-      <w:r>
-        <w:rPr>
-          <w:rFonts w:ascii="Helvetica Neue" w:hAnsi="Helvetica Neue"/>
-          <w:color w:val="000000"/>
-        </w:rPr>
-        <w:t>The beans turned atmospheric nitrogen into a natural fertilizer for the maize</w:t>
-      </w:r>
-    </w:p>
-    <w:p>
-      <w:pPr>
-        <w:shd w:val="clear" w:color="auto" w:fill="FFFFFF"/>
-        <w:spacing w:line="420" w:lineRule="atLeast"/>
-        <w:rPr>
-          <w:rFonts w:ascii="Helvetica Neue" w:hAnsi="Helvetica Neue"/>
-          <w:color w:val="000000"/>
-        </w:rPr>
-      </w:pPr>
-      <w:r>
-        <w:rPr>
-          <w:rFonts w:ascii="Helvetica Neue" w:hAnsi="Helvetica Neue"/>
-          <w:color w:val="000000"/>
-        </w:rPr>
-        <w:t>The beans and maize were able to grow in areas with sun and natural fertilizer</w:t>
-      </w:r>
-    </w:p>
-    <w:p>
-      <w:pPr>
-        <w:shd w:val="clear" w:color="auto" w:fill="FFFFFF"/>
-        <w:spacing w:line="420" w:lineRule="atLeast"/>
-        <w:rPr>
-          <w:rFonts w:ascii="Helvetica Neue" w:hAnsi="Helvetica Neue"/>
-          <w:color w:val="000000"/>
-        </w:rPr>
-      </w:pPr>
-      <w:r>
-        <w:rPr>
-          <w:rFonts w:ascii="Helvetica Neue" w:hAnsi="Helvetica Neue"/>
-          <w:color w:val="000000"/>
-        </w:rPr>
-        <w:t>The maize helped the beans reach the sun while the beans fertilized the maize</w:t>
-      </w:r>
-    </w:p>
-    <w:p/>
-    <w:p>
-      <w:pPr>
-        <w:shd w:val="clear" w:color="auto" w:fill="FFFFFF"/>
-        <w:spacing w:after="75"/>
-        <w:rPr>
-          <w:rFonts w:ascii="Helvetica Neue" w:hAnsi="Helvetica Neue"/>
-          <w:b/>
-          <w:bCs/>
-          <w:color w:val="000000"/>
-        </w:rPr>
-      </w:pPr>
-      <w:r>
-        <w:rPr>
-          <w:rFonts w:ascii="Helvetica Neue" w:hAnsi="Helvetica Neue"/>
-          <w:b/>
-          <w:bCs/>
-          <w:color w:val="000000"/>
-        </w:rPr>
-        <w:t>According to paragraph 3, men made which of the following contributions to Lenape plant cultivation?</w:t>
-      </w:r>
-    </w:p>
-    <w:p>
-      <w:pPr>
-        <w:shd w:val="clear" w:color="auto" w:fill="FFFFFF"/>
-        <w:spacing w:line="420" w:lineRule="atLeast"/>
-        <w:rPr>
-          <w:rFonts w:ascii="Helvetica Neue" w:hAnsi="Helvetica Neue"/>
-          <w:color w:val="000000"/>
-        </w:rPr>
-      </w:pPr>
-      <w:r>
-        <w:rPr>
-          <w:rFonts w:ascii="Helvetica Neue" w:hAnsi="Helvetica Neue"/>
-          <w:color w:val="000000"/>
-        </w:rPr>
-        <w:t>They planted maize seeds</w:t>
-      </w:r>
-    </w:p>
-    <w:p>
-      <w:pPr>
-        <w:shd w:val="clear" w:color="auto" w:fill="FFFFFF"/>
-        <w:spacing w:line="420" w:lineRule="atLeast"/>
-        <w:rPr>
-          <w:rFonts w:ascii="Helvetica Neue" w:hAnsi="Helvetica Neue"/>
-          <w:color w:val="000000"/>
-        </w:rPr>
-      </w:pPr>
-      <w:r>
-        <w:rPr>
-          <w:rFonts w:ascii="Helvetica Neue" w:hAnsi="Helvetica Neue"/>
-          <w:color w:val="000000"/>
-        </w:rPr>
-        <w:t>They created ash that fertilized the soil</w:t>
-      </w:r>
-    </w:p>
-    <w:p>
-      <w:pPr>
-        <w:shd w:val="clear" w:color="auto" w:fill="FFFFFF"/>
-        <w:spacing w:line="420" w:lineRule="atLeast"/>
-        <w:rPr>
-          <w:rFonts w:ascii="Helvetica Neue" w:hAnsi="Helvetica Neue"/>
-          <w:color w:val="000000"/>
-        </w:rPr>
-      </w:pPr>
-      <w:r>
-        <w:rPr>
-          <w:rFonts w:ascii="Helvetica Neue" w:hAnsi="Helvetica Neue"/>
-          <w:color w:val="000000"/>
-        </w:rPr>
-        <w:t>They removed weeds from around the crops</w:t>
-      </w:r>
-    </w:p>
-    <w:p>
-      <w:pPr>
-        <w:shd w:val="clear" w:color="auto" w:fill="FFFFFF"/>
-        <w:spacing w:line="420" w:lineRule="atLeast"/>
-        <w:rPr>
-          <w:rFonts w:ascii="Helvetica Neue" w:hAnsi="Helvetica Neue"/>
-          <w:color w:val="000000"/>
-        </w:rPr>
-      </w:pPr>
-      <w:r>
-        <w:rPr>
-          <w:rFonts w:ascii="Helvetica Neue" w:hAnsi="Helvetica Neue"/>
-          <w:color w:val="000000"/>
-        </w:rPr>
-        <w:t>They improved soil moisture with irrigation</w:t>
-      </w:r>
-    </w:p>
-    <w:p/>
-    <w:p>
-      <w:pPr>
-        <w:shd w:val="clear" w:color="auto" w:fill="FFFFFF"/>
-        <w:spacing w:after="75"/>
-        <w:rPr>
-          <w:rFonts w:ascii="Helvetica Neue" w:hAnsi="Helvetica Neue"/>
-          <w:b/>
-          <w:bCs/>
-          <w:color w:val="000000"/>
-        </w:rPr>
-      </w:pPr>
-      <w:r>
-        <w:rPr>
-          <w:rFonts w:ascii="Helvetica Neue" w:hAnsi="Helvetica Neue"/>
-          <w:b/>
-          <w:bCs/>
-          <w:color w:val="000000"/>
-        </w:rPr>
-        <w:lastRenderedPageBreak/>
-        <w:t>Paragraph 3 suggests which of the following about squash grown on Lenape fields?</w:t>
-      </w:r>
-    </w:p>
-    <w:p>
-      <w:pPr>
-        <w:shd w:val="clear" w:color="auto" w:fill="FFFFFF"/>
-        <w:spacing w:line="420" w:lineRule="atLeast"/>
-        <w:rPr>
-          <w:rFonts w:ascii="Helvetica Neue" w:hAnsi="Helvetica Neue"/>
-          <w:color w:val="000000"/>
-        </w:rPr>
-      </w:pPr>
-      <w:r>
-        <w:rPr>
-          <w:rFonts w:ascii="Helvetica Neue" w:hAnsi="Helvetica Neue"/>
-          <w:color w:val="000000"/>
-        </w:rPr>
-        <w:t>It increased the availability of water for the maize and beans</w:t>
-      </w:r>
-    </w:p>
-    <w:p>
-      <w:pPr>
-        <w:shd w:val="clear" w:color="auto" w:fill="FFFFFF"/>
-        <w:spacing w:line="420" w:lineRule="atLeast"/>
-        <w:rPr>
-          <w:rFonts w:ascii="Helvetica Neue" w:hAnsi="Helvetica Neue"/>
-          <w:color w:val="000000"/>
-        </w:rPr>
-      </w:pPr>
-      <w:r>
-        <w:rPr>
-          <w:rFonts w:ascii="Helvetica Neue" w:hAnsi="Helvetica Neue"/>
-          <w:color w:val="000000"/>
-        </w:rPr>
-        <w:t>It was usually planted in late April</w:t>
-      </w:r>
-    </w:p>
-    <w:p>
-      <w:pPr>
-        <w:shd w:val="clear" w:color="auto" w:fill="FFFFFF"/>
-        <w:spacing w:line="420" w:lineRule="atLeast"/>
-        <w:rPr>
-          <w:rFonts w:ascii="Helvetica Neue" w:hAnsi="Helvetica Neue"/>
-          <w:color w:val="000000"/>
-        </w:rPr>
-      </w:pPr>
-      <w:r>
-        <w:rPr>
-          <w:rFonts w:ascii="Helvetica Neue" w:hAnsi="Helvetica Neue"/>
-          <w:color w:val="000000"/>
-        </w:rPr>
-        <w:t>It led to increasing weeds</w:t>
-      </w:r>
-    </w:p>
-    <w:p>
-      <w:pPr>
-        <w:shd w:val="clear" w:color="auto" w:fill="FFFFFF"/>
-        <w:spacing w:line="420" w:lineRule="atLeast"/>
-        <w:rPr>
-          <w:rFonts w:ascii="Helvetica Neue" w:hAnsi="Helvetica Neue"/>
-          <w:color w:val="000000"/>
-        </w:rPr>
-      </w:pPr>
-      <w:r>
-        <w:rPr>
-          <w:rFonts w:ascii="Helvetica Neue" w:hAnsi="Helvetica Neue"/>
-          <w:color w:val="000000"/>
-        </w:rPr>
-        <w:t>It needed irrigation in order to grow successfully</w:t>
-      </w:r>
-    </w:p>
-    <w:p>
-      <w:pPr>
-        <w:shd w:val="clear" w:color="auto" w:fill="FFFFFF"/>
-        <w:spacing w:line="420" w:lineRule="atLeast"/>
-        <w:rPr>
-          <w:rFonts w:ascii="Helvetica Neue" w:hAnsi="Helvetica Neue"/>
-          <w:color w:val="000000"/>
-        </w:rPr>
-      </w:pPr>
-    </w:p>
-    <w:p>
-      <w:pPr>
-        <w:shd w:val="clear" w:color="auto" w:fill="FFFFFF"/>
-        <w:spacing w:after="75"/>
-        <w:rPr>
-          <w:rFonts w:ascii="Helvetica Neue" w:hAnsi="Helvetica Neue"/>
-          <w:b/>
-          <w:bCs/>
-          <w:color w:val="000000"/>
-        </w:rPr>
-      </w:pPr>
-      <w:r>
-        <w:rPr>
-          <w:rFonts w:ascii="Helvetica Neue" w:hAnsi="Helvetica Neue"/>
-          <w:b/>
-          <w:bCs/>
-          <w:color w:val="000000"/>
-        </w:rPr>
-        <w:t>In paragraph 5, why does the author mention that Lenape women had to perform tasks other than gardening?</w:t>
-      </w:r>
-    </w:p>
-    <w:p>
-      <w:pPr>
-        <w:shd w:val="clear" w:color="auto" w:fill="FFFFFF"/>
-        <w:spacing w:line="420" w:lineRule="atLeast"/>
-        <w:rPr>
-          <w:rFonts w:ascii="Helvetica Neue" w:hAnsi="Helvetica Neue"/>
-          <w:color w:val="000000"/>
-        </w:rPr>
-      </w:pPr>
-      <w:r>
-        <w:rPr>
-          <w:rFonts w:ascii="Helvetica Neue" w:hAnsi="Helvetica Neue"/>
-          <w:color w:val="000000"/>
-        </w:rPr>
-        <w:t>To suggest that Lenape women were treated unfairly</w:t>
-      </w:r>
-    </w:p>
-    <w:p>
-      <w:pPr>
-        <w:shd w:val="clear" w:color="auto" w:fill="FFFFFF"/>
-        <w:spacing w:line="420" w:lineRule="atLeast"/>
-        <w:rPr>
-          <w:rFonts w:ascii="Helvetica Neue" w:hAnsi="Helvetica Neue"/>
-          <w:color w:val="000000"/>
-        </w:rPr>
-      </w:pPr>
-      <w:r>
-        <w:rPr>
-          <w:rFonts w:ascii="Helvetica Neue" w:hAnsi="Helvetica Neue"/>
-          <w:color w:val="000000"/>
-        </w:rPr>
-        <w:t>To challenge the belief that gardening was a woman’s responsibility</w:t>
-      </w:r>
-    </w:p>
-    <w:p>
-      <w:pPr>
-        <w:shd w:val="clear" w:color="auto" w:fill="FFFFFF"/>
-        <w:spacing w:line="420" w:lineRule="atLeast"/>
-        <w:rPr>
-          <w:rFonts w:ascii="Helvetica Neue" w:hAnsi="Helvetica Neue"/>
-          <w:color w:val="000000"/>
-        </w:rPr>
-      </w:pPr>
-      <w:r>
-        <w:rPr>
-          <w:rFonts w:ascii="Helvetica Neue" w:hAnsi="Helvetica Neue"/>
-          <w:color w:val="000000"/>
-        </w:rPr>
-        <w:t>To provide a factor that limited the total amount of food grown on Lenape fields</w:t>
-      </w:r>
-    </w:p>
-    <w:p>
-      <w:pPr>
-        <w:shd w:val="clear" w:color="auto" w:fill="FFFFFF"/>
-        <w:spacing w:line="420" w:lineRule="atLeast"/>
-        <w:rPr>
-          <w:rFonts w:ascii="Helvetica Neue" w:hAnsi="Helvetica Neue"/>
-          <w:color w:val="000000"/>
-        </w:rPr>
-      </w:pPr>
-      <w:r>
-        <w:rPr>
-          <w:rFonts w:ascii="Helvetica Neue" w:hAnsi="Helvetica Neue"/>
-          <w:color w:val="000000"/>
-        </w:rPr>
-        <w:t>To demonstrate that Lenape gardening was similar to modern gardening</w:t>
-      </w:r>
-    </w:p>
-    <w:p>
-      <w:pPr>
-        <w:shd w:val="clear" w:color="auto" w:fill="FFFFFF"/>
-        <w:spacing w:after="75"/>
-        <w:rPr>
-          <w:rFonts w:ascii="Helvetica Neue" w:hAnsi="Helvetica Neue" w:hint="eastAsia"/>
-          <w:b/>
-          <w:bCs/>
-          <w:color w:val="000000"/>
-        </w:rPr>
-      </w:pPr>
     </w:p>
     <w:p>
       <w:pPr>
@@ -7371,7 +7509,7 @@
       <w:pPr>
         <w:shd w:val="clear" w:color="auto" w:fill="FFFFFF"/>
         <w:rPr>
-          <w:rFonts w:ascii="Helvetica Neue" w:hAnsi="Helvetica Neue" w:hint="eastAsia"/>
+          <w:rFonts w:ascii="Helvetica Neue" w:hAnsi="Helvetica Neue"/>
           <w:color w:val="333333"/>
         </w:rPr>
       </w:pPr>
@@ -7401,7 +7539,7 @@
         <w:shd w:val="clear" w:color="auto" w:fill="FFFFFF"/>
         <w:spacing w:line="270" w:lineRule="atLeast"/>
         <w:rPr>
-          <w:rFonts w:ascii="Helvetica Neue" w:hAnsi="Helvetica Neue" w:hint="eastAsia"/>
+          <w:rFonts w:ascii="Helvetica Neue" w:hAnsi="Helvetica Neue"/>
           <w:color w:val="333333"/>
         </w:rPr>
       </w:pPr>
@@ -7463,7 +7601,7 @@
         <w:shd w:val="clear" w:color="auto" w:fill="FFFFFF"/>
         <w:spacing w:line="270" w:lineRule="atLeast"/>
         <w:rPr>
-          <w:rFonts w:ascii="Helvetica Neue" w:hAnsi="Helvetica Neue" w:hint="eastAsia"/>
+          <w:rFonts w:ascii="Helvetica Neue" w:hAnsi="Helvetica Neue"/>
           <w:color w:val="333333"/>
         </w:rPr>
       </w:pPr>
@@ -7516,7 +7654,7 @@
         <w:shd w:val="clear" w:color="auto" w:fill="FFFFFF"/>
         <w:spacing w:line="270" w:lineRule="atLeast"/>
         <w:rPr>
-          <w:rFonts w:ascii="Helvetica Neue" w:hAnsi="Helvetica Neue" w:hint="eastAsia"/>
+          <w:rFonts w:ascii="Helvetica Neue" w:hAnsi="Helvetica Neue"/>
           <w:color w:val="333333"/>
         </w:rPr>
       </w:pPr>
@@ -7596,6 +7734,7 @@
           <w:rFonts w:ascii="Helvetica Neue" w:hAnsi="Helvetica Neue"/>
           <w:color w:val="333333"/>
         </w:rPr>
+        <w:lastRenderedPageBreak/>
         <w:t xml:space="preserve">D. </w:t>
       </w:r>
       <w:r>
@@ -7632,16 +7771,15 @@
         <w:shd w:val="clear" w:color="auto" w:fill="FFFFFF"/>
         <w:spacing w:line="270" w:lineRule="atLeast"/>
         <w:rPr>
-          <w:rFonts w:ascii="Helvetica Neue" w:hAnsi="Helvetica Neue" w:hint="eastAsia"/>
-          <w:color w:val="333333"/>
-        </w:rPr>
-      </w:pPr>
-      <w:r>
-        <w:rPr>
-          <w:rFonts w:ascii="Helvetica Neue" w:hAnsi="Helvetica Neue"/>
-          <w:color w:val="333333"/>
-        </w:rPr>
-        <w:lastRenderedPageBreak/>
+          <w:rFonts w:ascii="Helvetica Neue" w:hAnsi="Helvetica Neue"/>
+          <w:color w:val="333333"/>
+        </w:rPr>
+      </w:pPr>
+      <w:r>
+        <w:rPr>
+          <w:rFonts w:ascii="Helvetica Neue" w:hAnsi="Helvetica Neue"/>
+          <w:color w:val="333333"/>
+        </w:rPr>
         <w:t>E. Crop models have shown that the Lenape "three sisters" horticulture on Manhattan produced a significant probability of crop failure because of low nitrogen levels in the soil</w:t>
       </w:r>
       <w:r>
@@ -7671,7 +7809,7 @@
         <w:shd w:val="clear" w:color="auto" w:fill="FFFFFF"/>
         <w:spacing w:line="270" w:lineRule="atLeast"/>
         <w:rPr>
-          <w:rFonts w:ascii="Helvetica Neue" w:hAnsi="Helvetica Neue" w:hint="eastAsia"/>
+          <w:rFonts w:ascii="Helvetica Neue" w:hAnsi="Helvetica Neue"/>
           <w:color w:val="333333"/>
         </w:rPr>
       </w:pPr>
@@ -7771,9 +7909,6 @@
     <w:p>
       <w:pPr>
         <w:pStyle w:val="CommentText"/>
-        <w:rPr>
-          <w:rFonts w:hint="eastAsia"/>
-        </w:rPr>
       </w:pPr>
       <w:r>
         <w:rPr>
@@ -7796,9 +7931,6 @@
     <w:p>
       <w:pPr>
         <w:pStyle w:val="CommentText"/>
-        <w:rPr>
-          <w:rFonts w:hint="eastAsia"/>
-        </w:rPr>
       </w:pPr>
       <w:r>
         <w:rPr>
@@ -7827,9 +7959,6 @@
     <w:p>
       <w:pPr>
         <w:pStyle w:val="CommentText"/>
-        <w:rPr>
-          <w:rFonts w:hint="eastAsia"/>
-        </w:rPr>
       </w:pPr>
       <w:r>
         <w:rPr>
@@ -7857,9 +7986,6 @@
     <w:p>
       <w:pPr>
         <w:pStyle w:val="CommentText"/>
-        <w:rPr>
-          <w:rFonts w:hint="eastAsia"/>
-        </w:rPr>
       </w:pPr>
       <w:r>
         <w:rPr>
@@ -7879,9 +8005,6 @@
     <w:p>
       <w:pPr>
         <w:pStyle w:val="CommentText"/>
-        <w:rPr>
-          <w:rFonts w:hint="eastAsia"/>
-        </w:rPr>
       </w:pPr>
       <w:r>
         <w:rPr>
@@ -8012,9 +8135,6 @@
     <w:p>
       <w:pPr>
         <w:pStyle w:val="CommentText"/>
-        <w:rPr>
-          <w:rFonts w:hint="eastAsia"/>
-        </w:rPr>
       </w:pPr>
       <w:r>
         <w:rPr>
@@ -8054,9 +8174,6 @@
     <w:p>
       <w:pPr>
         <w:pStyle w:val="CommentText"/>
-        <w:rPr>
-          <w:rFonts w:hint="eastAsia"/>
-        </w:rPr>
       </w:pPr>
       <w:r>
         <w:rPr>
@@ -8073,9 +8190,6 @@
     <w:p>
       <w:pPr>
         <w:pStyle w:val="CommentText"/>
-        <w:rPr>
-          <w:rFonts w:hint="eastAsia"/>
-        </w:rPr>
       </w:pPr>
       <w:r>
         <w:rPr>
@@ -8168,9 +8282,6 @@
     <w:p>
       <w:pPr>
         <w:pStyle w:val="CommentText"/>
-        <w:rPr>
-          <w:rFonts w:hint="eastAsia"/>
-        </w:rPr>
       </w:pPr>
       <w:r>
         <w:rPr>
@@ -8202,62 +8313,56 @@
     <w:p>
       <w:pPr>
         <w:pStyle w:val="CommentText"/>
+      </w:pPr>
+      <w:r>
+        <w:rPr>
+          <w:rStyle w:val="CommentReference"/>
+        </w:rPr>
+        <w:annotationRef/>
+      </w:r>
+      <w:r>
         <w:rPr>
           <w:rFonts w:hint="eastAsia"/>
         </w:rPr>
-      </w:pPr>
-      <w:r>
-        <w:rPr>
-          <w:rStyle w:val="CommentReference"/>
-        </w:rPr>
-        <w:annotationRef/>
+        <w:t>具体操作</w:t>
+      </w:r>
+      <w:r>
+        <w:t>maize</w:t>
       </w:r>
       <w:r>
         <w:rPr>
           <w:rFonts w:hint="eastAsia"/>
         </w:rPr>
-        <w:t>具体操作</w:t>
-      </w:r>
-      <w:r>
-        <w:t>maize</w:t>
+        <w:t>种植和</w:t>
+      </w:r>
+      <w:r>
+        <w:t>beans</w:t>
       </w:r>
       <w:r>
         <w:rPr>
           <w:rFonts w:hint="eastAsia"/>
         </w:rPr>
-        <w:t>种植和</w:t>
-      </w:r>
-      <w:r>
-        <w:t>beans</w:t>
+        <w:t>一起</w:t>
       </w:r>
       <w:r>
         <w:rPr>
           <w:rFonts w:hint="eastAsia"/>
         </w:rPr>
-        <w:t>一起</w:t>
+        <w:t>，s</w:t>
+      </w:r>
+      <w:r>
+        <w:t>quash</w:t>
       </w:r>
       <w:r>
         <w:rPr>
           <w:rFonts w:hint="eastAsia"/>
         </w:rPr>
-        <w:t>，s</w:t>
-      </w:r>
-      <w:r>
-        <w:t>quash</w:t>
-      </w:r>
-      <w:r>
-        <w:rPr>
-          <w:rFonts w:hint="eastAsia"/>
-        </w:rPr>
         <w:t>南瓜</w:t>
       </w:r>
     </w:p>
     <w:p>
       <w:pPr>
         <w:pStyle w:val="CommentText"/>
-        <w:rPr>
-          <w:rFonts w:hint="eastAsia"/>
-        </w:rPr>
       </w:pPr>
       <w:r>
         <w:rPr>
@@ -8290,9 +8395,6 @@
     <w:p>
       <w:pPr>
         <w:pStyle w:val="CommentText"/>
-        <w:rPr>
-          <w:rFonts w:hint="eastAsia"/>
-        </w:rPr>
       </w:pPr>
       <w:r>
         <w:rPr>

</xml_diff>